<commit_message>
DL 405/XXV/2026: observações 02 em segunda versão
Mesma substância, linguagem corrente e registo de dúvida em vez de
exposição. Menos remissões encadeadas, exemplo concreto do coelho e do
hamster, e oferta de ajuda na redação. 247 palavras. A primeira versão
mantém-se no processo.

Co-Authored-By: Claude Opus 5 <noreply@anthropic.com>
Claude-Session: https://claude.ai/code/session_01ETNym69SS49ymutsXowEHk
</commit_message>
<xml_diff>
--- a/DL 405_2026/Fundamentacao_das_Observacoes.docx
+++ b/DL 405_2026/Fundamentacao_das_Observacoes.docx
@@ -3270,6 +3270,44 @@
               <w:rPr>
                 <w:sz w:val="18"/>
               </w:rPr>
+              <w:t>Observações 02 em segunda versão, em linguagem corrente e em registo de dúvida, a pedido. A primeira versão fica no processo. Ambas assentam na fundamentação deste ponto 02, que não foi alterada.</w:t>
+            </w:r>
+          </w:p>
+        </w:tc>
+      </w:tr>
+      <w:tr>
+        <w:tc>
+          <w:tcPr>
+            <w:tcW w:type="dxa" w:w="1361"/>
+          </w:tcPr>
+          <w:p>
+            <w:pPr>
+              <w:spacing w:after="40"/>
+              <w:jc w:val="both"/>
+            </w:pPr>
+            <w:r/>
+            <w:r>
+              <w:rPr>
+                <w:sz w:val="18"/>
+              </w:rPr>
+              <w:t>6.10.2026</w:t>
+            </w:r>
+          </w:p>
+        </w:tc>
+        <w:tc>
+          <w:tcPr>
+            <w:tcW w:type="dxa" w:w="7427"/>
+          </w:tcPr>
+          <w:p>
+            <w:pPr>
+              <w:spacing w:after="40"/>
+              <w:jc w:val="both"/>
+            </w:pPr>
+            <w:r/>
+            <w:r>
+              <w:rPr>
+                <w:sz w:val="18"/>
+              </w:rPr>
               <w:t>Correção ao contributo interno de 5.10.2026: o seu ponto 5.4 afirmava que a venda de animais em feiras e no comércio não sedentário ficava sem requisitos de bem-estar. O n.º 6 do art.º 35.º do Decreto-Lei n.º 276/2001 proíbe a venda ambulante de animais de companhia e o mesmo artigo fixa as condições da venda em feiras e mercados, com mera comunicação prévia à câmara para vistoria pelo médico veterinário municipal. Não há lacuna, há falta de articulação. O tema passou ao ponto 06 desta série.</w:t>
             </w:r>
           </w:p>

</xml_diff>

<commit_message>
DL 405/XXV/2026: observações 02 v.3 e secção sobre a Lei da Saúde Animal
Observações 02 em terceira versão, 199 palavras: alerta reduzido ao
essencial, a exclusão da apicultura que ficou e a dos animais de
companhia que saiu, e o enquadramento no DL 276/2001 e no ponto 11 do
artigo 4.º do Regulamento (UE) 2016/429, que define animal de companhia
pela finalidade da detenção.

Acrescenta à fundamentação a secção transversal sobre a Lei da Saúde
Animal: o registo do artigo 9.º do Regulamento (UE) 2026/1818 encaixa
nos artigos 84.º e 101.º daquele regulamento, a fronteira pedida ao
diploma nacional já é europeia, e a detenção caseira funde duas
categorias que o direito da União separa. Fica assinalado que o teor dos
artigos 84.º e 101.º não foi lido no Jornal Oficial nesta sessão.

Co-Authored-By: Claude Opus 5 <noreply@anthropic.com>
Claude-Session: https://claude.ai/code/session_01ETNym69SS49ymutsXowEHk
</commit_message>
<xml_diff>
--- a/DL 405_2026/Fundamentacao_das_Observacoes.docx
+++ b/DL 405_2026/Fundamentacao_das_Observacoes.docx
@@ -3145,6 +3145,344 @@
           <w:color w:val="1F3B63"/>
           <w:sz w:val="26"/>
         </w:rPr>
+        <w:t>Secção transversal — A Lei da Saúde Animal como pano de fundo</w:t>
+      </w:r>
+    </w:p>
+    <w:p>
+      <w:pPr>
+        <w:spacing w:after="120"/>
+      </w:pPr>
+      <w:r>
+        <w:rPr>
+          <w:b w:val="0"/>
+          <w:i w:val="0"/>
+          <w:sz w:val="21"/>
+        </w:rPr>
+        <w:t>Esta secção serve os pontos 01, 02 e 09 e explica por que razão o Regulamento (UE) 2016/429, Lei da Saúde Animal, é o enquadramento que decide as duas questões já fechadas.</w:t>
+      </w:r>
+    </w:p>
+    <w:p>
+      <w:pPr>
+        <w:spacing w:before="240" w:after="80"/>
+      </w:pPr>
+      <w:r>
+        <w:rPr>
+          <w:b/>
+          <w:color w:val="1F3B63"/>
+          <w:sz w:val="22"/>
+        </w:rPr>
+        <w:t>T.1. O registo de 2028 é o registo da Lei da Saúde Animal</w:t>
+      </w:r>
+    </w:p>
+    <w:p>
+      <w:pPr>
+        <w:spacing w:after="120"/>
+      </w:pPr>
+      <w:r>
+        <w:rPr>
+          <w:b w:val="0"/>
+          <w:i w:val="0"/>
+          <w:sz w:val="21"/>
+        </w:rPr>
+        <w:t>A obrigação de notificação dos estabelecimentos do artigo 9.º do Regulamento (UE) 2026/1818 não cria sistema novo: encaixa no da Lei da Saúde Animal, e di-lo expressamente.</w:t>
+      </w:r>
+    </w:p>
+    <w:p>
+      <w:pPr>
+        <w:spacing w:after="40"/>
+        <w:ind w:left="454" w:right="227"/>
+      </w:pPr>
+      <w:r>
+        <w:rPr>
+          <w:i/>
+          <w:sz w:val="19"/>
+        </w:rPr>
+        <w:t>«3. Member States shall use the information provided for in accordance with Article 84 of Regulation (EU) 2016/429. Operators shall not be required to notify the information already submitted in accordance with that Article again. 4. The competent authority shall keep a register of establishments. The competent authority may, for that purpose, use the register established pursuant to Article 101(1), point (a), of Regulation (EU) 2016/429.»</w:t>
+      </w:r>
+    </w:p>
+    <w:p>
+      <w:pPr>
+        <w:spacing w:after="160"/>
+        <w:ind w:left="454"/>
+      </w:pPr>
+      <w:r>
+        <w:rPr>
+          <w:color w:val="555555"/>
+          <w:sz w:val="17"/>
+        </w:rPr>
+        <w:t>art.º 9.º, n.ºs 3 e 4, do Regulamento (UE) 2026/1818 — versão inglesa, JO L, 2026/1818, de 10.8.2026.</w:t>
+      </w:r>
+    </w:p>
+    <w:p>
+      <w:pPr>
+        <w:spacing w:after="40"/>
+        <w:ind w:left="454" w:right="227"/>
+      </w:pPr>
+      <w:r>
+        <w:rPr>
+          <w:i/>
+          <w:sz w:val="19"/>
+        </w:rPr>
+        <w:t>«3. Os Estados-Membros devem utilizar as informações facultadas em conformidade com o artigo 84.º do Regulamento (UE) 2016/429. Os operadores não são obrigados a notificar novamente as informações já comunicadas em conformidade com o referido artigo. 4. A autoridade competente deve manter um registo de estabelecimentos. A autoridade competente pode utilizar, para esse efeito, o registo criado nos termos do artigo 101.º, n.º 1, alínea a), do Regulamento (UE) 2016/429.»</w:t>
+      </w:r>
+    </w:p>
+    <w:p>
+      <w:pPr>
+        <w:spacing w:after="160"/>
+        <w:ind w:left="454"/>
+      </w:pPr>
+      <w:r>
+        <w:rPr>
+          <w:color w:val="555555"/>
+          <w:sz w:val="17"/>
+        </w:rPr>
+        <w:t>art.º 9.º, n.ºs 3 e 4, do Regulamento (UE) 2026/1818 — versão portuguesa.</w:t>
+      </w:r>
+    </w:p>
+    <w:p>
+      <w:pPr>
+        <w:spacing w:after="120"/>
+      </w:pPr>
+      <w:r>
+        <w:rPr>
+          <w:b w:val="0"/>
+          <w:i w:val="0"/>
+          <w:sz w:val="21"/>
+        </w:rPr>
+        <w:t>Daqui decorre que a obrigação de registo destes estabelecimentos não nasce em 31 de agosto de 2028. O artigo 84.º da Lei da Saúde Animal, aplicável desde 21 de abril de 2021, impõe aos operadores de estabelecimentos que detêm animais terrestres o dever de informar a autoridade competente antes de iniciar a atividade, para que o estabelecimento seja registado; e o artigo 101.º impõe à autoridade competente a constituição e manutenção dos registos correspondentes. Nenhum dos dois está limitado às espécies pecuárias, pelo que o criador e a loja de cães e gatos são, nessa aceção, estabelecimentos. O que o Regulamento de 2026 acrescenta é conteúdo e publicidade, não a obrigação de base.</w:t>
+      </w:r>
+    </w:p>
+    <w:p>
+      <w:pPr>
+        <w:spacing w:before="240" w:after="80"/>
+      </w:pPr>
+      <w:r>
+        <w:rPr>
+          <w:b/>
+          <w:color w:val="1F3B63"/>
+          <w:sz w:val="22"/>
+        </w:rPr>
+        <w:t>T.2. A fronteira que se pede ao diploma nacional já é europeia</w:t>
+      </w:r>
+    </w:p>
+    <w:p>
+      <w:pPr>
+        <w:spacing w:after="120"/>
+      </w:pPr>
+      <w:r>
+        <w:rPr>
+          <w:b w:val="0"/>
+          <w:i w:val="0"/>
+          <w:sz w:val="21"/>
+        </w:rPr>
+        <w:t>A Lei da Saúde Animal distingue animal de companhia de animal detido em estabelecimento, e distingue-o pela finalidade da detenção:</w:t>
+      </w:r>
+    </w:p>
+    <w:p>
+      <w:pPr>
+        <w:spacing w:after="40"/>
+        <w:ind w:left="454" w:right="227"/>
+      </w:pPr>
+      <w:r>
+        <w:rPr>
+          <w:i/>
+          <w:sz w:val="19"/>
+        </w:rPr>
+        <w:t>«11) «Animal de companhia», um animal detido das espécies listadas no anexo I, que é detido para fins privados não comerciais;»</w:t>
+      </w:r>
+    </w:p>
+    <w:p>
+      <w:pPr>
+        <w:spacing w:after="160"/>
+        <w:ind w:left="454"/>
+      </w:pPr>
+      <w:r>
+        <w:rPr>
+          <w:color w:val="555555"/>
+          <w:sz w:val="17"/>
+        </w:rPr>
+        <w:t>art.º 4.º, ponto 11, do Regulamento (UE) 2016/429.</w:t>
+      </w:r>
+    </w:p>
+    <w:p>
+      <w:pPr>
+        <w:spacing w:after="120"/>
+      </w:pPr>
+      <w:r>
+        <w:rPr>
+          <w:b w:val="0"/>
+          <w:i w:val="0"/>
+          <w:sz w:val="21"/>
+        </w:rPr>
+        <w:t>É o mesmo critério que o projeto de RGAC adota no n.º 2 do seu artigo 2.º, com a distinção entre as espécies da Parte A do Anexo I, que são sempre animais de companhia, e as da Parte B, que o são quando detidas para fins de companhia. O critério que as observações 02 pedem não é, por isso, uma invenção nacional: é o critério do direito da União, de aplicação direta, que o próprio projeto já invoca ao referir, na al. d) do art.º 2.º do anexo, o regime de identificação, registo e circulação dos animais.</w:t>
+      </w:r>
+    </w:p>
+    <w:p>
+      <w:pPr>
+        <w:spacing w:before="240" w:after="80"/>
+      </w:pPr>
+      <w:r>
+        <w:rPr>
+          <w:b/>
+          <w:color w:val="1F3B63"/>
+          <w:sz w:val="22"/>
+        </w:rPr>
+        <w:t>T.3. A «detenção caseira» funde duas categorias que a Lei da Saúde Animal separa</w:t>
+      </w:r>
+    </w:p>
+    <w:p>
+      <w:pPr>
+        <w:spacing w:after="120"/>
+      </w:pPr>
+      <w:r>
+        <w:rPr>
+          <w:b w:val="0"/>
+          <w:i w:val="0"/>
+          <w:sz w:val="21"/>
+        </w:rPr>
+        <w:t>A al. i) do art.º 48.º do anexo define a detenção caseira pela posse de animais cujo objetivo é «de lazer ou abastecimento do seu detentor». São duas realidades distintas à luz da Lei da Saúde Animal. A detenção por lazer, sem comércio, corresponde à detenção de animais de companhia na aceção do art.º 4.º, ponto 11, e não constitui estabelecimento. A detenção para abastecimento do próprio detentor é produção primária e cai no âmbito do art.º 84.º, com as derrogações que este e o Regulamento Delegado (UE) 2019/2035 admitem para estabelecimentos de pequena dimensão.</w:t>
+      </w:r>
+    </w:p>
+    <w:p>
+      <w:pPr>
+        <w:spacing w:after="120"/>
+      </w:pPr>
+      <w:r>
+        <w:rPr>
+          <w:b w:val="0"/>
+          <w:i w:val="0"/>
+          <w:sz w:val="21"/>
+        </w:rPr>
+        <w:t>Sujeitar ambas, indistintamente, ao registo no SNIRA trata como exploração pecuária aquilo que o direito europeu classifica como detenção de animais de companhia. É esta a observação de fundo do ponto 02, e é por esta via, e não pela reposição da exclusão eliminada, que ela melhor se sustenta: preserva o objetivo de rastreabilidade de quem produz e deixa de fora quem detém apenas por companhia.</w:t>
+      </w:r>
+    </w:p>
+    <w:p>
+      <w:pPr>
+        <w:spacing w:before="240" w:after="80"/>
+      </w:pPr>
+      <w:r>
+        <w:rPr>
+          <w:b/>
+          <w:color w:val="1F3B63"/>
+          <w:sz w:val="22"/>
+        </w:rPr>
+        <w:t>T.4. O veículo nacional do registo</w:t>
+      </w:r>
+    </w:p>
+    <w:p>
+      <w:pPr>
+        <w:spacing w:after="120"/>
+      </w:pPr>
+      <w:r>
+        <w:rPr>
+          <w:b w:val="0"/>
+          <w:i w:val="0"/>
+          <w:sz w:val="21"/>
+        </w:rPr>
+        <w:t>Em Portugal, o registo que materializa o art.º 101.º da Lei da Saúde Animal quanto a estabelecimentos de animais de companhia é, hoje, a lista da DGAV das meras comunicações prévias do art.º 3.º-A do Decreto-Lei n.º 276/2001, divulgada nos termos do n.º 12 do seu art.º 3.º. O projeto de RGAC consolida essa função no SIAC, que passa a ser a base de dados oficial de identificação e registo dos animais de companhia, do RNAZ e dos estabelecimentos, e monta no artigo da divulgação dos estabelecimentos a lista pública com número único de aprovação, exigida também pelo n.º 3 do art.º 10.º do Regulamento (UE) 2026/1818.</w:t>
+      </w:r>
+    </w:p>
+    <w:p>
+      <w:pPr>
+        <w:spacing w:after="120"/>
+      </w:pPr>
+      <w:r>
+        <w:rPr>
+          <w:b w:val="0"/>
+          <w:i w:val="0"/>
+          <w:sz w:val="21"/>
+        </w:rPr>
+        <w:t>É esta a ligação ao ponto 01: encaminhada a loja de animais para um procedimento puramente municipal, sem pronúncia nem notificação da DGAV, nada do que o procedimento recolhe alimenta o registo que a autoridade competente tem de manter. E é esta a ligação ao ponto 09: o cadastro setorial e a base de dados setorial do anexo não incluem o SIAC entre os sistemas a articular.</w:t>
+      </w:r>
+    </w:p>
+    <w:p>
+      <w:pPr>
+        <w:spacing w:before="240" w:after="80"/>
+      </w:pPr>
+      <w:r>
+        <w:rPr>
+          <w:b/>
+          <w:color w:val="1F3B63"/>
+          <w:sz w:val="22"/>
+        </w:rPr>
+        <w:t>T.5. Fontes e verificações pendentes desta secção</w:t>
+      </w:r>
+    </w:p>
+    <w:p>
+      <w:pPr>
+        <w:pStyle w:val="ListBullet"/>
+        <w:spacing w:after="60"/>
+        <w:jc w:val="both"/>
+      </w:pPr>
+      <w:r>
+        <w:rPr>
+          <w:sz w:val="21"/>
+        </w:rPr>
+        <w:t>Regulamento (UE) 2026/1818 — art.º 9.º, n.ºs 3 e 4, e art.º 10.º, n.º 3, nas versões inglesa e portuguesa do texto publicado no Jornal Oficial. Confirmado.</w:t>
+      </w:r>
+    </w:p>
+    <w:p>
+      <w:pPr>
+        <w:pStyle w:val="ListBullet"/>
+        <w:spacing w:after="60"/>
+        <w:jc w:val="both"/>
+      </w:pPr>
+      <w:r>
+        <w:rPr>
+          <w:sz w:val="21"/>
+        </w:rPr>
+        <w:t>Regulamento (UE) 2016/429 — art.º 4.º, ponto 11. Confirmado.</w:t>
+      </w:r>
+    </w:p>
+    <w:p>
+      <w:pPr>
+        <w:pStyle w:val="ListBullet"/>
+        <w:spacing w:after="60"/>
+        <w:jc w:val="both"/>
+      </w:pPr>
+      <w:r>
+        <w:rPr>
+          <w:sz w:val="21"/>
+        </w:rPr>
+        <w:t>Regulamento (UE) 2016/429 — art.ºs 84.º, 93.º e 101.º. O teor foi apurado por fonte secundária: o acesso ao EUR-Lex foi recusado a partir deste ambiente, pelo que o texto não foi lido no Jornal Oficial. A descrição acima não deve ser usada como citação verbatim sem essa confirmação.</w:t>
+      </w:r>
+    </w:p>
+    <w:p>
+      <w:pPr>
+        <w:pStyle w:val="ListBullet"/>
+        <w:spacing w:after="60"/>
+        <w:jc w:val="both"/>
+      </w:pPr>
+      <w:r>
+        <w:rPr>
+          <w:sz w:val="21"/>
+        </w:rPr>
+        <w:t>Regulamento Delegado (UE) 2019/2035 da Comissão — referido pelo projeto de RGAC, inclusive quanto ao art.º 71.º-A, em matéria de rastreabilidade de cães, gatos e furões. Não verificado nesta sessão.</w:t>
+      </w:r>
+    </w:p>
+    <w:p>
+      <w:pPr>
+        <w:pStyle w:val="ListBullet"/>
+        <w:spacing w:after="60"/>
+        <w:jc w:val="both"/>
+      </w:pPr>
+      <w:r>
+        <w:rPr>
+          <w:sz w:val="21"/>
+        </w:rPr>
+        <w:t>Verificação pendente: se os estabelecimentos de animais de companhia estão hoje efetivamente registados ao abrigo do art.º 84.º da Lei da Saúde Animal e em que sistema. É a pergunta que determina se existe já um incumprimento a corrigir ou apenas um risco a prevenir.</w:t>
+      </w:r>
+    </w:p>
+    <w:p>
+      <w:pPr>
+        <w:spacing w:before="360" w:after="120"/>
+      </w:pPr>
+      <w:r>
+        <w:rPr>
+          <w:b/>
+          <w:color w:val="1F3B63"/>
+          <w:sz w:val="26"/>
+        </w:rPr>
         <w:t>Registo de alterações</w:t>
       </w:r>
     </w:p>
@@ -3233,6 +3571,44 @@
                 <w:sz w:val="18"/>
               </w:rPr>
               <w:t>Criação do documento. Índice da série e numeração. Fundamentação dos pontos 01 e 02.</w:t>
+            </w:r>
+          </w:p>
+        </w:tc>
+      </w:tr>
+      <w:tr>
+        <w:tc>
+          <w:tcPr>
+            <w:tcW w:type="dxa" w:w="1361"/>
+          </w:tcPr>
+          <w:p>
+            <w:pPr>
+              <w:spacing w:after="40"/>
+              <w:jc w:val="both"/>
+            </w:pPr>
+            <w:r/>
+            <w:r>
+              <w:rPr>
+                <w:sz w:val="18"/>
+              </w:rPr>
+              <w:t>6.10.2026</w:t>
+            </w:r>
+          </w:p>
+        </w:tc>
+        <w:tc>
+          <w:tcPr>
+            <w:tcW w:type="dxa" w:w="7427"/>
+          </w:tcPr>
+          <w:p>
+            <w:pPr>
+              <w:spacing w:after="40"/>
+              <w:jc w:val="both"/>
+            </w:pPr>
+            <w:r/>
+            <w:r>
+              <w:rPr>
+                <w:sz w:val="18"/>
+              </w:rPr>
+              <w:t>Secção transversal sobre a Lei da Saúde Animal, Regulamento (UE) 2016/429, que enquadra os pontos 01, 02 e 09. Observações 02 em terceira versão, com o alerta reduzido ao essencial e o enquadramento no Decreto-Lei n.º 276/2001 e na Lei da Saúde Animal.</w:t>
             </w:r>
           </w:p>
         </w:tc>

</xml_diff>

<commit_message>
DL 405/XXV/2026: observações 02 trocam a alternativa fraca pela boa
A v.3 oferecia repor a exclusão eliminada ou adotar o critério da Lei da
Saúde Animal. A primeira via reabriria o vazio em que hoje caem o coelho
e o roedor detidos por companhia, excluídos do DL 276/2001 pelo n.º 2 do
artigo 1.º e, até agora, do regime pecuário pela alínea a) do n.º 3 do
artigo 1.º do DL 81/2013. Fica só o critério finalista, com ressalva
expressa das obrigações de identificação e registo, e com o
reconhecimento do objetivo de rastreabilidade. 200 palavras.

Acrescenta à fundamentação o ponto 2.5-A, sobre o que a alteração
resolve e que a lei atual não resolve, incluindo o caso do criador
informal, e sobre o erro de técnica de usar uma só qualificação para
decidir o registo e o padrão de bem-estar.

Co-Authored-By: Claude Opus 5 <noreply@anthropic.com>
Claude-Session: https://claude.ai/code/session_01ETNym69SS49ymutsXowEHk
</commit_message>
<xml_diff>
--- a/DL 405_2026/Fundamentacao_das_Observacoes.docx
+++ b/DL 405_2026/Fundamentacao_das_Observacoes.docx
@@ -2218,6 +2218,84 @@
           <w:color w:val="1F3B63"/>
           <w:sz w:val="22"/>
         </w:rPr>
+        <w:t>2.5-A. O que a alteração resolve, e que a lei atual não resolve</w:t>
+      </w:r>
+    </w:p>
+    <w:p>
+      <w:pPr>
+        <w:spacing w:after="120"/>
+      </w:pPr>
+      <w:r>
+        <w:rPr>
+          <w:b w:val="0"/>
+          <w:i w:val="0"/>
+          <w:sz w:val="21"/>
+        </w:rPr>
+        <w:t>A eliminação da exclusão não é só perda. Fecha um vazio que é, ele próprio, um problema nosso, e isso tem de ser dito para que a observação seja equilibrada.</w:t>
+      </w:r>
+    </w:p>
+    <w:p>
+      <w:pPr>
+        <w:spacing w:after="120"/>
+      </w:pPr>
+      <w:r>
+        <w:rPr>
+          <w:b w:val="0"/>
+          <w:i w:val="0"/>
+          <w:sz w:val="21"/>
+        </w:rPr>
+        <w:t>Hoje o coelho, a galinha ou o pónei detidos em casa por gosto não estão com segurança em nenhum dos dois regimes: o n.º 2 do art.º 1.º do Decreto-Lei n.º 276/2001 exclui «as espécies de pecuária» e a al. a) do n.º 3 do art.º 1.º do Decreto-Lei n.º 81/2013 excluía os animais de companhia. Que o art.º 26.º do primeiro fixe medidas de caixa para coelhos e pequenos roedores resolve a contradição por interpretação e não por texto, o que é frágil: basta invocar a natureza pecuária da espécie para discutir a aplicação do diploma.</w:t>
+      </w:r>
+    </w:p>
+    <w:p>
+      <w:pPr>
+        <w:spacing w:after="120"/>
+      </w:pPr>
+      <w:r>
+        <w:rPr>
+          <w:b w:val="0"/>
+          <w:i w:val="0"/>
+          <w:sz w:val="21"/>
+        </w:rPr>
+        <w:t>Resolve ainda dois problemas concretos. O primeiro é o criador informal de coelhos, roedores ou aves para o mercado dos animais de companhia: a al. aa) do n.º 1 do art.º 2.º do Decreto-Lei n.º 276/2001 define criação comercial como possuir «uma ou mais fêmeas reprodutoras cujas crias sejam destinadas ao comércio», o que o apanharia, mas a exclusão das espécies de pecuária dá-lhe argumento para sair. Sem a exclusão do lado pecuário, a cláusula da al. b) do art.º 48.º apanha-o. O segundo é a visibilidade do pequeno detentor, hoje inexistente, de que dependem a fiscalização, o controlo de zoonoses e a identificação do detentor do animal encontrado errante.</w:t>
+      </w:r>
+    </w:p>
+    <w:p>
+      <w:pPr>
+        <w:spacing w:after="120"/>
+      </w:pPr>
+      <w:r>
+        <w:rPr>
+          <w:b w:val="0"/>
+          <w:i w:val="0"/>
+          <w:sz w:val="21"/>
+        </w:rPr>
+        <w:t>O problema não é, por isso, o fecho do vazio: é o parâmetro com que se fecha. Pela via pecuária, a referência de bem-estar daquele coelho passa a ser a cabeça normal e a capacidade instalada, grandezas concebidas para medir densidade produtiva e efluentes. O vazio fecha-se, a proteção não melhora.</w:t>
+      </w:r>
+    </w:p>
+    <w:p>
+      <w:pPr>
+        <w:spacing w:after="120"/>
+      </w:pPr>
+      <w:r>
+        <w:rPr>
+          <w:b w:val="0"/>
+          <w:i w:val="0"/>
+          <w:sz w:val="21"/>
+        </w:rPr>
+        <w:t>Daqui resulta o erro de técnica que sustenta a observação, e que é mais sólido do que a discussão da exclusão: a redação usa uma única qualificação, ser ou não atividade pecuária, para decidir duas questões independentes, quem fica registado e qual o padrão de bem-estar aplicável. A Lei da Saúde Animal separa-as, ao registar animais de companhia para efeitos de circulação sem os tratar como efetivo. Por isso a formulação pedida não é a reposição da exclusão, que devolveria estes animais à terra de ninguém, mas a adoção do critério finalista com ressalva expressa das obrigações de identificação e registo.</w:t>
+      </w:r>
+    </w:p>
+    <w:p>
+      <w:pPr>
+        <w:spacing w:before="240" w:after="80"/>
+      </w:pPr>
+      <w:r>
+        <w:rPr>
+          <w:b/>
+          <w:color w:val="1F3B63"/>
+          <w:sz w:val="22"/>
+        </w:rPr>
         <w:t>2.6. O efeito cruzado com o regime dos animais de companhia</w:t>
       </w:r>
     </w:p>
@@ -3571,6 +3649,44 @@
                 <w:sz w:val="18"/>
               </w:rPr>
               <w:t>Criação do documento. Índice da série e numeração. Fundamentação dos pontos 01 e 02.</w:t>
+            </w:r>
+          </w:p>
+        </w:tc>
+      </w:tr>
+      <w:tr>
+        <w:tc>
+          <w:tcPr>
+            <w:tcW w:type="dxa" w:w="1361"/>
+          </w:tcPr>
+          <w:p>
+            <w:pPr>
+              <w:spacing w:after="40"/>
+              <w:jc w:val="both"/>
+            </w:pPr>
+            <w:r/>
+            <w:r>
+              <w:rPr>
+                <w:sz w:val="18"/>
+              </w:rPr>
+              <w:t>6.10.2026</w:t>
+            </w:r>
+          </w:p>
+        </w:tc>
+        <w:tc>
+          <w:tcPr>
+            <w:tcW w:type="dxa" w:w="7427"/>
+          </w:tcPr>
+          <w:p>
+            <w:pPr>
+              <w:spacing w:after="40"/>
+              <w:jc w:val="both"/>
+            </w:pPr>
+            <w:r/>
+            <w:r>
+              <w:rPr>
+                <w:sz w:val="18"/>
+              </w:rPr>
+              <w:t>Observações 02 ajustadas: a alternativa de repor a exclusão eliminada foi substituída pela adoção do critério finalista com ressalva das obrigações de identificação e registo, por se reconhecer que a reposição reabriria um vazio. Acrescentado o ponto 2.5-A, sobre o que a alteração resolve e que a lei atual não resolve.</w:t>
             </w:r>
           </w:p>
         </w:tc>

</xml_diff>

<commit_message>
DL 405/XXV/2026: observações 02 v.4 — dúvida de aplicação, sem proposta
Deixa de propor redação e passa a colocar a pergunta concreta: a detenção
caseira de coelhos ou de pequenos roedores por lazer fica sujeita a que
normas de bem-estar? Liga-se à questão já aberta no articulado sobre as
normas de bem-estar aplicáveis à atividade pecuária, e apresenta os três
candidatos mostrando que nenhum serve: a Portaria n.º 635/2009, que
assenta nas classes de licenciamento, o DL 142/2006, para onde o artigo
51.º remete e que é identificação e registo, e o DL 276/2001, cujo artigo
26.º fixa as medidas das caixas mas que exclui as espécies de pecuária.
197 palavras.

Na fundamentação, ponto 2.5-B: os três encaminhamentos para a DGAV
registados no ficheiro e a correção relativa à Portaria n.º 635/2009, que
estreita a delimitação do vazio.

Co-Authored-By: Claude Opus 5 <noreply@anthropic.com>
Claude-Session: https://claude.ai/code/session_01ETNym69SS49ymutsXowEHk
</commit_message>
<xml_diff>
--- a/DL 405_2026/Fundamentacao_das_Observacoes.docx
+++ b/DL 405_2026/Fundamentacao_das_Observacoes.docx
@@ -2296,6 +2296,110 @@
           <w:color w:val="1F3B63"/>
           <w:sz w:val="22"/>
         </w:rPr>
+        <w:t>2.5-B. A norma de bem-estar aplicável: os fios já abertos no ficheiro</w:t>
+      </w:r>
+    </w:p>
+    <w:p>
+      <w:pPr>
+        <w:spacing w:after="120"/>
+      </w:pPr>
+      <w:r>
+        <w:rPr>
+          <w:b w:val="0"/>
+          <w:i w:val="0"/>
+          <w:sz w:val="21"/>
+        </w:rPr>
+        <w:t>A observação enviada na quarta versão abandona a proposta de redação e passa a colocar uma dúvida de aplicação: a detenção caseira de coelhos ou de pequenos roedores por lazer fica sujeita a que normas de bem-estar? A escolha tem três fundamentos.</w:t>
+      </w:r>
+    </w:p>
+    <w:p>
+      <w:pPr>
+        <w:spacing w:after="120"/>
+      </w:pPr>
+      <w:r>
+        <w:rPr>
+          <w:b w:val="0"/>
+          <w:i w:val="0"/>
+          <w:sz w:val="21"/>
+        </w:rPr>
+        <w:t>O primeiro é que a questão já está aberta no documento, e foi aberta do lado do Gabinete. No parágrafo que hoje é o n.º 1 do art.º 54.º, que manda o operador agir «no respeito pelas normas de bem-estar animal», está um comentário de Paulo Meireles de Oliveira a observar que essas normas «parecem decorrer dos regimes complementares e não revogados» e a enumerá-las: o Decreto-Lei n.º 64/2000, o n.º 48/2001 relativo a vitelos, o n.º 72-F/2003 relativo a galinhas poedeiras e o n.º 135/2003 relativo a suínos. O Gabinete encaminhou com «@Pecuária» e a resposta registada foi «Ponderar junto da DGAV e DGADR». Há dois encaminhamentos equivalentes: na linha dos leporídeos do art.º 50.º, «Ver com DGAV e DGADR», e na epígrafe do art.º 51.º, «Verificar com DGAV e DGADR». A observação responde a um fio aberto, não abre um novo.</w:t>
+      </w:r>
+    </w:p>
+    <w:p>
+      <w:pPr>
+        <w:spacing w:after="120"/>
+      </w:pPr>
+      <w:r>
+        <w:rPr>
+          <w:b w:val="0"/>
+          <w:i w:val="0"/>
+          <w:sz w:val="21"/>
+        </w:rPr>
+        <w:t>Note-se o que falta na enumeração do revisor: leporídeos e roedores. Não por omissão, mas porque para essas espécies as normas estão em portaria.</w:t>
+      </w:r>
+    </w:p>
+    <w:p>
+      <w:pPr>
+        <w:spacing w:after="120"/>
+      </w:pPr>
+      <w:r>
+        <w:rPr>
+          <w:b w:val="0"/>
+          <w:i w:val="0"/>
+          <w:sz w:val="21"/>
+        </w:rPr>
+        <w:t>O segundo fundamento é que o diploma dá pistas de resposta e nenhuma é conclusiva. O art.º 2.º enumera os regimes a articular e não inclui o Decreto-Lei n.º 276/2001. O art.º 36.º, n.º 1, manda cumprir requisitos de higiene e de saúde pública, e o seu n.º 3 refere a legislação aplicável aos «produtos». O art.º 50.º, n.º 1, al. e), habilita portaria sobre a «detenção e produção pecuária» de leporídeos e outras espécies. O art.º 51.º remete para o Decreto-Lei n.º 142/2006. E o art.º 54.º manda respeitar «as normas de bem-estar animal» e «as normas de funcionamento previstas para as espécies», sem as identificar.</w:t>
+      </w:r>
+    </w:p>
+    <w:p>
+      <w:pPr>
+        <w:spacing w:after="120"/>
+      </w:pPr>
+      <w:r>
+        <w:rPr>
+          <w:b w:val="0"/>
+          <w:i w:val="0"/>
+          <w:sz w:val="21"/>
+        </w:rPr>
+        <w:t>O terceiro é a delimitação correta do vazio, que obriga a corrigir uma afirmação feita antes nesta análise. Não é exato que as únicas normas específicas para coelhos e pequenos roedores estejam no art.º 26.º e no Anexo II do Decreto-Lei n.º 276/2001. A Portaria n.º 635/2009, de 9 de junho, estabelece as normas regulamentares da detenção e produção pecuária de leporídeos em explorações e núcleos de produção cunícula, armazéns e centros de agrupamento, identifica três sistemas de produção, entre eles o de animais de companhia, e fixa requisitos de instalações e medidas sanitárias. A cláusula da al. b) do art.º 48.º tem, por isso, contrapartida regulamentar desde 2009.</w:t>
+      </w:r>
+    </w:p>
+    <w:p>
+      <w:pPr>
+        <w:spacing w:after="120"/>
+      </w:pPr>
+      <w:r>
+        <w:rPr>
+          <w:b w:val="0"/>
+          <w:i w:val="0"/>
+          <w:sz w:val="21"/>
+        </w:rPr>
+        <w:t>O vazio é, então, outro e mais estreito. Aquela portaria assenta nas classes do regime pecuário e a detenção caseira criada pelo projeto situa-se abaixo da classe 3, que subsiste no n.º 4 do art.º 16.º para capacidades até 15 CN, e é expressamente isenta de licenciamento. A pergunta é se uma detenção isenta de licenciamento é alcançada por regulamentação construída sobre as classes de licenciamento. Se for, aplicam-se a um animal de estimação requisitos de isolamento térmico, de lavabilidade de paredes e pavimentos e de vazio sanitário entre lotes, que são parâmetros de produção. Se não for, não se aplica norma alguma.</w:t>
+      </w:r>
+    </w:p>
+    <w:p>
+      <w:pPr>
+        <w:spacing w:after="120"/>
+      </w:pPr>
+      <w:r>
+        <w:rPr>
+          <w:b w:val="0"/>
+          <w:i w:val="0"/>
+          <w:sz w:val="21"/>
+        </w:rPr>
+        <w:t>Risco a antecipar: a resposta pode ser «aplica-se a Portaria n.º 635/2009». O contra-argumento é o do parágrafo anterior, e foi deliberadamente deixado fora da observação enviada, para que esta se mantenha como dúvida e não se transforme em alegação.</w:t>
+      </w:r>
+    </w:p>
+    <w:p>
+      <w:pPr>
+        <w:spacing w:before="240" w:after="80"/>
+      </w:pPr>
+      <w:r>
+        <w:rPr>
+          <w:b/>
+          <w:color w:val="1F3B63"/>
+          <w:sz w:val="22"/>
+        </w:rPr>
         <w:t>2.6. O efeito cruzado com o regime dos animais de companhia</w:t>
       </w:r>
     </w:p>
@@ -3649,6 +3753,44 @@
                 <w:sz w:val="18"/>
               </w:rPr>
               <w:t>Criação do documento. Índice da série e numeração. Fundamentação dos pontos 01 e 02.</w:t>
+            </w:r>
+          </w:p>
+        </w:tc>
+      </w:tr>
+      <w:tr>
+        <w:tc>
+          <w:tcPr>
+            <w:tcW w:type="dxa" w:w="1361"/>
+          </w:tcPr>
+          <w:p>
+            <w:pPr>
+              <w:spacing w:after="40"/>
+              <w:jc w:val="both"/>
+            </w:pPr>
+            <w:r/>
+            <w:r>
+              <w:rPr>
+                <w:sz w:val="18"/>
+              </w:rPr>
+              <w:t>6.10.2026</w:t>
+            </w:r>
+          </w:p>
+        </w:tc>
+        <w:tc>
+          <w:tcPr>
+            <w:tcW w:type="dxa" w:w="7427"/>
+          </w:tcPr>
+          <w:p>
+            <w:pPr>
+              <w:spacing w:after="40"/>
+              <w:jc w:val="both"/>
+            </w:pPr>
+            <w:r/>
+            <w:r>
+              <w:rPr>
+                <w:sz w:val="18"/>
+              </w:rPr>
+              <w:t>Observações 02 em quarta versão, 197 palavras: deixa de propor redação e passa a colocar uma dúvida de aplicação sobre a norma de bem-estar aplicável à detenção caseira, ligando-se a um fio já aberto no ficheiro. Acrescentado o ponto 2.5-B, com os três encaminhamentos para a DGAV registados no documento e com a correção relativa à Portaria n.º 635/2009, que estreita a delimitação do vazio.</w:t>
             </w:r>
           </w:p>
         </w:tc>

</xml_diff>

<commit_message>
Fundamentação: ligação do ponto 02 à lista positiva de animais de companhia
O n.º 3 do artigo 4.º do projeto de RGAC prevê a lista positiva, a
publicar por portaria dos membros do Governo da agricultura e do
ambiente. O artigo 50.º do projeto de DL das atividades económicas
habilita portaria do membro do Governo da agricultura sobre a detenção e
produção pecuária de leporídeos e outras espécies. Duas habilitações
sobre o mesmo ato e a mesma espécie, sem regra de articulação.

Registada também a incoerência interna do RGAC entre o n.º 2 do artigo
2.º, que usa o critério finalista para a Parte B do Anexo I do
Regulamento (UE) 2016/429, e o n.º 2 do artigo 4.º, que o omite.

Co-Authored-By: Claude Opus 5 <noreply@anthropic.com>
Claude-Session: https://claude.ai/code/session_01ETNym69SS49ymutsXowEHk
</commit_message>
<xml_diff>
--- a/DL 405_2026/Fundamentacao_das_Observacoes.docx
+++ b/DL 405_2026/Fundamentacao_das_Observacoes.docx
@@ -3319,6 +3319,338 @@
     </w:p>
     <w:p>
       <w:pPr>
+        <w:spacing w:before="240" w:after="80"/>
+      </w:pPr>
+      <w:r>
+        <w:rPr>
+          <w:b/>
+          <w:color w:val="1F3B63"/>
+          <w:sz w:val="22"/>
+        </w:rPr>
+        <w:t>2.5-C. A ligação à lista positiva de animais de companhia</w:t>
+      </w:r>
+    </w:p>
+    <w:p>
+      <w:pPr>
+        <w:spacing w:after="120"/>
+      </w:pPr>
+      <w:r>
+        <w:rPr>
+          <w:b w:val="0"/>
+          <w:i w:val="0"/>
+          <w:sz w:val="21"/>
+        </w:rPr>
+        <w:t>A questão do ponto 02 é, no fundo, de classificação: a lei decide o regime de bem-estar nomeando espécies, e a mesma espécie acaba em dois regimes. A Lei da Saúde Animal dá o critério da finalidade mas não diz quais as espécies que podem ser detidas como animais de companhia. O instrumento que fecha essa questão é a lista positiva, e o projeto de RGAC já a prevê.</w:t>
+      </w:r>
+    </w:p>
+    <w:p>
+      <w:pPr>
+        <w:spacing w:after="40"/>
+        <w:ind w:left="454" w:right="227"/>
+      </w:pPr>
+      <w:r>
+        <w:rPr>
+          <w:i/>
+          <w:sz w:val="19"/>
+        </w:rPr>
+        <w:t>«3 - Sem prejuízo do disposto nos n.ºs anteriores, serão considerados animais de companhia aqueles que vierem a integrar a lista positiva de animais de companhia (ou lista nacional de animais de companhia), a publicar em Portaria dos membros do Governo responsáveis pelas áreas da agricultura e do ambiente.»</w:t>
+      </w:r>
+    </w:p>
+    <w:p>
+      <w:pPr>
+        <w:spacing w:after="160"/>
+        <w:ind w:left="454"/>
+      </w:pPr>
+      <w:r>
+        <w:rPr>
+          <w:color w:val="555555"/>
+          <w:sz w:val="17"/>
+        </w:rPr>
+        <w:t>n.º 3 do art.º 4.º do projeto de RGAC, versão de trabalho de 30.6.2026. O n.º 4 do mesmo artigo exclui a fauna selvagem indígena e não indígena, as espécies da Lista Nacional de Espécies Invasoras, as inscritas na CITES e as perigosas e exóticas sujeitas a legislação especial; o n.º 5 permite à DGAV a exclusão cautelar imediata de uma espécie.</w:t>
+      </w:r>
+    </w:p>
+    <w:p>
+      <w:pPr>
+        <w:spacing w:after="120"/>
+      </w:pPr>
+      <w:r>
+        <w:rPr>
+          <w:b w:val="0"/>
+          <w:i w:val="0"/>
+          <w:sz w:val="21"/>
+        </w:rPr>
+        <w:t>A figura vem do RGBEAC de junho de 2025, onde é apresentada como uma das principais inovações, com referência comparada à Bélgica, aos Países Baixos, à Finlândia, à França e a Chipre.</w:t>
+      </w:r>
+    </w:p>
+    <w:p>
+      <w:pPr>
+        <w:spacing w:after="120"/>
+      </w:pPr>
+      <w:r>
+        <w:rPr>
+          <w:b/>
+          <w:i w:val="0"/>
+          <w:sz w:val="21"/>
+        </w:rPr>
+        <w:t>Daqui resulta um argumento de legística, concreto e verificável: há duas habilitações regulamentares concorrentes sobre o mesmo ato, a detenção, relativamente à mesma espécie.</w:t>
+      </w:r>
+    </w:p>
+    <w:tbl>
+      <w:tblPr>
+        <w:tblStyle w:val="TableGrid"/>
+        <w:tblW w:type="auto" w:w="0"/>
+        <w:jc w:val="center"/>
+        <w:tblLook w:firstColumn="1" w:firstRow="1" w:lastColumn="0" w:lastRow="0" w:noHBand="0" w:noVBand="1" w:val="04A0"/>
+      </w:tblPr>
+      <w:tblGrid>
+        <w:gridCol w:w="3135"/>
+        <w:gridCol w:w="3135"/>
+        <w:gridCol w:w="3135"/>
+      </w:tblGrid>
+      <w:tr>
+        <w:tc>
+          <w:tcPr>
+            <w:tcW w:type="dxa" w:w="2835"/>
+          </w:tcPr>
+          <w:p>
+            <w:pPr>
+              <w:spacing w:after="40"/>
+            </w:pPr>
+            <w:r/>
+            <w:r>
+              <w:rPr>
+                <w:b/>
+                <w:color w:val="1F3B63"/>
+                <w:sz w:val="18"/>
+              </w:rPr>
+              <w:t>Instrumento</w:t>
+            </w:r>
+          </w:p>
+        </w:tc>
+        <w:tc>
+          <w:tcPr>
+            <w:tcW w:type="dxa" w:w="3685"/>
+          </w:tcPr>
+          <w:p>
+            <w:pPr>
+              <w:spacing w:after="40"/>
+            </w:pPr>
+            <w:r/>
+            <w:r>
+              <w:rPr>
+                <w:b/>
+                <w:color w:val="1F3B63"/>
+                <w:sz w:val="18"/>
+              </w:rPr>
+              <w:t>Objeto</w:t>
+            </w:r>
+          </w:p>
+        </w:tc>
+        <w:tc>
+          <w:tcPr>
+            <w:tcW w:type="dxa" w:w="2268"/>
+          </w:tcPr>
+          <w:p>
+            <w:pPr>
+              <w:spacing w:after="40"/>
+            </w:pPr>
+            <w:r/>
+            <w:r>
+              <w:rPr>
+                <w:b/>
+                <w:color w:val="1F3B63"/>
+                <w:sz w:val="18"/>
+              </w:rPr>
+              <w:t>Portaria de quem</w:t>
+            </w:r>
+          </w:p>
+        </w:tc>
+      </w:tr>
+      <w:tr>
+        <w:tc>
+          <w:tcPr>
+            <w:tcW w:type="dxa" w:w="2835"/>
+          </w:tcPr>
+          <w:p>
+            <w:pPr>
+              <w:spacing w:after="40"/>
+              <w:jc w:val="both"/>
+            </w:pPr>
+            <w:r/>
+            <w:r>
+              <w:rPr>
+                <w:sz w:val="18"/>
+              </w:rPr>
+              <w:t>Art.º 4.º, n.º 3, do projeto de RGAC</w:t>
+            </w:r>
+          </w:p>
+        </w:tc>
+        <w:tc>
+          <w:tcPr>
+            <w:tcW w:type="dxa" w:w="3685"/>
+          </w:tcPr>
+          <w:p>
+            <w:pPr>
+              <w:spacing w:after="40"/>
+              <w:jc w:val="both"/>
+            </w:pPr>
+            <w:r/>
+            <w:r>
+              <w:rPr>
+                <w:sz w:val="18"/>
+              </w:rPr>
+              <w:t>Lista positiva de animais de companhia, que determina quais as espécies qualificadas como animais de companhia</w:t>
+            </w:r>
+          </w:p>
+        </w:tc>
+        <w:tc>
+          <w:tcPr>
+            <w:tcW w:type="dxa" w:w="2268"/>
+          </w:tcPr>
+          <w:p>
+            <w:pPr>
+              <w:spacing w:after="40"/>
+              <w:jc w:val="both"/>
+            </w:pPr>
+            <w:r/>
+            <w:r>
+              <w:rPr>
+                <w:sz w:val="18"/>
+              </w:rPr>
+              <w:t>Membros do Governo responsáveis pela agricultura e pelo ambiente</w:t>
+            </w:r>
+          </w:p>
+        </w:tc>
+      </w:tr>
+      <w:tr>
+        <w:tc>
+          <w:tcPr>
+            <w:tcW w:type="dxa" w:w="2835"/>
+          </w:tcPr>
+          <w:p>
+            <w:pPr>
+              <w:spacing w:after="40"/>
+              <w:jc w:val="both"/>
+            </w:pPr>
+            <w:r/>
+            <w:r>
+              <w:rPr>
+                <w:sz w:val="18"/>
+              </w:rPr>
+              <w:t>Art.º 50.º, n.º 1, al. e), do anexo do projeto de DL das atividades económicas</w:t>
+            </w:r>
+          </w:p>
+        </w:tc>
+        <w:tc>
+          <w:tcPr>
+            <w:tcW w:type="dxa" w:w="3685"/>
+          </w:tcPr>
+          <w:p>
+            <w:pPr>
+              <w:spacing w:after="40"/>
+              <w:jc w:val="both"/>
+            </w:pPr>
+            <w:r/>
+            <w:r>
+              <w:rPr>
+                <w:sz w:val="18"/>
+              </w:rPr>
+              <w:t>Normas regulamentares aplicáveis à «detenção e produção pecuária» de «Leporídeos e outras espécies»</w:t>
+            </w:r>
+          </w:p>
+        </w:tc>
+        <w:tc>
+          <w:tcPr>
+            <w:tcW w:type="dxa" w:w="2268"/>
+          </w:tcPr>
+          <w:p>
+            <w:pPr>
+              <w:spacing w:after="40"/>
+              <w:jc w:val="both"/>
+            </w:pPr>
+            <w:r/>
+            <w:r>
+              <w:rPr>
+                <w:sz w:val="18"/>
+              </w:rPr>
+              <w:t>Membro do Governo responsável pela agricultura e pelo desenvolvimento rural</w:t>
+            </w:r>
+          </w:p>
+        </w:tc>
+      </w:tr>
+    </w:tbl>
+    <w:p>
+      <w:pPr>
+        <w:spacing w:after="80"/>
+      </w:pPr>
+    </w:p>
+    <w:p>
+      <w:pPr>
+        <w:spacing w:after="120"/>
+      </w:pPr>
+      <w:r>
+        <w:rPr>
+          <w:b w:val="0"/>
+          <w:i w:val="0"/>
+          <w:sz w:val="21"/>
+        </w:rPr>
+        <w:t>Mesma espécie, mesmo ato, duas portarias, conjuntos de signatários diferentes e nenhuma regra de articulação entre elas. A que for publicada primeiro fixa, por omissão, o regime do coelho ou do roedor detido por companhia.</w:t>
+      </w:r>
+    </w:p>
+    <w:p>
+      <w:pPr>
+        <w:spacing w:after="120"/>
+      </w:pPr>
+      <w:r>
+        <w:rPr>
+          <w:b w:val="0"/>
+          <w:i w:val="0"/>
+          <w:sz w:val="21"/>
+        </w:rPr>
+        <w:t>E há um argumento substantivo que decorre deste. A lista positiva só tem efeito útil se a qualificação tiver consequências. Se uma espécie puder constar da lista positiva de animais de companhia e ser, simultaneamente e sem distinção, espécie pecuária na mesma situação de detenção, a lista passa a ser um rótulo sem regime associado. A alteração assinalada no ponto 02 não afeta, por isso, apenas o Decreto-Lei n.º 276/2001: afeta o instrumento central do regime que estamos a preparar.</w:t>
+      </w:r>
+    </w:p>
+    <w:p>
+      <w:pPr>
+        <w:spacing w:after="120"/>
+      </w:pPr>
+      <w:r>
+        <w:rPr>
+          <w:b w:val="0"/>
+          <w:i w:val="0"/>
+          <w:sz w:val="21"/>
+        </w:rPr>
+        <w:t>Ressalva: o Regulamento (UE) 2026/1818 não prevê listas positivas. A pesquisa das expressões «lista positiva» e «positive list» nas versões portuguesa e inglesa do texto publicado não devolve ocorrências. A âncora desta figura é nacional e comparada, não europeia.</w:t>
+      </w:r>
+    </w:p>
+    <w:p>
+      <w:pPr>
+        <w:spacing w:after="120"/>
+      </w:pPr>
+      <w:r>
+        <w:rPr>
+          <w:b w:val="0"/>
+          <w:i w:val="0"/>
+          <w:sz w:val="21"/>
+        </w:rPr>
+        <w:t>Incoerência interna do RGAC que esta análise expõe, e que deve seguir para o memorando de acompanhamento: o n.º 2 do art.º 2.º qualifica as espécies da Parte B do Anexo I do Regulamento (UE) 2016/429 como animais de companhia «quando detidos para fins de companhia», enquanto o n.º 2 do art.º 4.º diz que essas espécies «são também considerados animais de companhia», sem o critério finalista. Sem esse critério, todo o coelho seria animal de companhia, incluindo o da cunicultura. É o lapso simétrico do que se assinala ao Gabinete.</w:t>
+      </w:r>
+    </w:p>
+    <w:p>
+      <w:pPr>
+        <w:spacing w:after="120"/>
+      </w:pPr>
+      <w:r>
+        <w:rPr>
+          <w:b w:val="0"/>
+          <w:i w:val="0"/>
+          <w:sz w:val="21"/>
+        </w:rPr>
+        <w:t>Nota de oportunidade: este argumento foi deliberadamente deixado fora da observação 02 enviada. Serve melhor como resposta de segunda volta, caso a resposta à dúvida de aplicação venha a ser a de que se aplica a portaria da pecuária. Jogado antes, permite que a articulação seja resolvida contra nós no próprio texto.</w:t>
+      </w:r>
+    </w:p>
+    <w:p>
+      <w:pPr>
         <w:spacing w:before="360" w:after="120"/>
       </w:pPr>
       <w:r>
@@ -3753,6 +4085,44 @@
                 <w:sz w:val="18"/>
               </w:rPr>
               <w:t>Criação do documento. Índice da série e numeração. Fundamentação dos pontos 01 e 02.</w:t>
+            </w:r>
+          </w:p>
+        </w:tc>
+      </w:tr>
+      <w:tr>
+        <w:tc>
+          <w:tcPr>
+            <w:tcW w:type="dxa" w:w="1361"/>
+          </w:tcPr>
+          <w:p>
+            <w:pPr>
+              <w:spacing w:after="40"/>
+              <w:jc w:val="both"/>
+            </w:pPr>
+            <w:r/>
+            <w:r>
+              <w:rPr>
+                <w:sz w:val="18"/>
+              </w:rPr>
+              <w:t>6.10.2026</w:t>
+            </w:r>
+          </w:p>
+        </w:tc>
+        <w:tc>
+          <w:tcPr>
+            <w:tcW w:type="dxa" w:w="7427"/>
+          </w:tcPr>
+          <w:p>
+            <w:pPr>
+              <w:spacing w:after="40"/>
+              <w:jc w:val="both"/>
+            </w:pPr>
+            <w:r/>
+            <w:r>
+              <w:rPr>
+                <w:sz w:val="18"/>
+              </w:rPr>
+              <w:t>Ponto 2.5-C: ligação à lista positiva de animais de companhia do n.º 3 do artigo 4.º do projeto de RGAC, com a colisão das duas habilitações regulamentares sobre a detenção da mesma espécie, e a incoerência interna do RGAC entre o n.º 2 do artigo 2.º e o n.º 2 do artigo 4.º, a remeter para o memorando de acompanhamento.</w:t>
             </w:r>
           </w:p>
         </w:tc>

</xml_diff>

<commit_message>
DL 405/XXV/2026: observações 03 — deferimento tácito com animais vivos
Coloca a dúvida sobre a adequação da regra do n.º 3 do artigo 25.º
quando a atividade envolve detenção de animais vivos, com dois apoios: o
n.º 2 do artigo 3.º-D do DL 276/2001, legislação vigente, que afasta
expressamente o deferimento tácito nas decisões sobre detenção de
animais, e o artigo 10.º do Regulamento (UE) 2026/1818, que a partir de
31.8.2034 exige aprovação com inspeção no local. Nota que o artigo 31.º
não prevê causa de indeferimento fundada em bem-estar animal. 195
palavras.

A fundamentação acrescenta a delimitação face à comunicação prévia, as
citações verbatim nas duas línguas e um efeito colateral fora do nosso
âmbito, a sinalizar à segurança alimentar: a conjugação do artigo 14.º
com o deferimento tácito e o prazo de 30 dias do Anexo III.

Co-Authored-By: Claude Opus 5 <noreply@anthropic.com>
Claude-Session: https://claude.ai/code/session_01ETNym69SS49ymutsXowEHk
</commit_message>
<xml_diff>
--- a/DL 405_2026/Fundamentacao_das_Observacoes.docx
+++ b/DL 405_2026/Fundamentacao_das_Observacoes.docx
@@ -438,7 +438,7 @@
               <w:rPr>
                 <w:sz w:val="18"/>
               </w:rPr>
-              <w:t>Art.º 25.º</w:t>
+              <w:t>Art.º 25.º, n.º 3</w:t>
             </w:r>
           </w:p>
         </w:tc>
@@ -456,7 +456,7 @@
               <w:rPr>
                 <w:sz w:val="18"/>
               </w:rPr>
-              <w:t>Previsto</w:t>
+              <w:t>Fechado</w:t>
             </w:r>
           </w:p>
         </w:tc>
@@ -3659,6 +3659,396 @@
           <w:color w:val="1F3B63"/>
           <w:sz w:val="26"/>
         </w:rPr>
+        <w:t>Ponto 03 — Deferimento tácito em atividades com animais vivos</w:t>
+      </w:r>
+    </w:p>
+    <w:p>
+      <w:pPr>
+        <w:spacing w:before="240" w:after="80"/>
+      </w:pPr>
+      <w:r>
+        <w:rPr>
+          <w:b/>
+          <w:color w:val="1F3B63"/>
+          <w:sz w:val="22"/>
+        </w:rPr>
+        <w:t>3.1. A regra no projeto</w:t>
+      </w:r>
+    </w:p>
+    <w:p>
+      <w:pPr>
+        <w:spacing w:after="120"/>
+      </w:pPr>
+      <w:r>
+        <w:rPr>
+          <w:b w:val="0"/>
+          <w:i w:val="0"/>
+          <w:sz w:val="21"/>
+        </w:rPr>
+        <w:t>O preâmbulo declara a intenção: o regime é consonante com a ação governativa no sentido de «consagrar como regra o deferimento tácito, sustentado pela confiança e responsabilidade dos operadores económicos». A concretização está no artigo 25.º do anexo.</w:t>
+      </w:r>
+    </w:p>
+    <w:p>
+      <w:pPr>
+        <w:spacing w:after="40"/>
+        <w:ind w:left="454" w:right="227"/>
+      </w:pPr>
+      <w:r>
+        <w:rPr>
+          <w:i/>
+          <w:sz w:val="19"/>
+        </w:rPr>
+        <w:t>«3 - Caso não seja emitida pronúncia no prazo definido no n.º 1, considera-se que a mesma é favorável à pretensão do requerente.»</w:t>
+      </w:r>
+    </w:p>
+    <w:p>
+      <w:pPr>
+        <w:spacing w:after="160"/>
+        <w:ind w:left="454"/>
+      </w:pPr>
+      <w:r>
+        <w:rPr>
+          <w:color w:val="555555"/>
+          <w:sz w:val="17"/>
+        </w:rPr>
+        <w:t>n.º 3 do art.º 25.º («Pronúncia das entidades públicas consultadas e deferimento tácito») do anexo, na versão de 25.9.2026. O n.º 4 prevê a emissão de certidão com menção expressa ao deferimento, sem taxa.</w:t>
+      </w:r>
+    </w:p>
+    <w:p>
+      <w:pPr>
+        <w:spacing w:after="120"/>
+      </w:pPr>
+      <w:r>
+        <w:rPr>
+          <w:b w:val="0"/>
+          <w:i w:val="0"/>
+          <w:sz w:val="21"/>
+        </w:rPr>
+        <w:t>Os prazos são os do Anexo III. Para as consultas sem prazo próprio aplica-se a linha residual «Outras consultas — 20 dias»; para os regimes em matéria de segurança da cadeia alimentar, 30 dias.</w:t>
+      </w:r>
+    </w:p>
+    <w:p>
+      <w:pPr>
+        <w:spacing w:after="120"/>
+      </w:pPr>
+      <w:r>
+        <w:rPr>
+          <w:b w:val="0"/>
+          <w:i w:val="0"/>
+          <w:sz w:val="21"/>
+        </w:rPr>
+        <w:t>Importa delimitar o alcance. O deferimento tácito do art.º 25.º opera no procedimento de comunicação com prazo e no de comunicação com prazo e vistoria, que são os que têm fase de pronúncia. No procedimento de comunicação prévia não há deferimento tácito porque não há decisão a diferir: o n.º 3 do art.º 29.º determina que o título é emitido automaticamente com a apresentação. São duas insuficiências distintas, e esta observação respeita à primeira.</w:t>
+      </w:r>
+    </w:p>
+    <w:p>
+      <w:pPr>
+        <w:spacing w:before="240" w:after="80"/>
+      </w:pPr>
+      <w:r>
+        <w:rPr>
+          <w:b/>
+          <w:color w:val="1F3B63"/>
+          <w:sz w:val="22"/>
+        </w:rPr>
+        <w:t>3.2. A legislação vigente afasta-o expressamente neste domínio</w:t>
+      </w:r>
+    </w:p>
+    <w:p>
+      <w:pPr>
+        <w:spacing w:after="120"/>
+      </w:pPr>
+      <w:r>
+        <w:rPr>
+          <w:b w:val="0"/>
+          <w:i w:val="0"/>
+          <w:sz w:val="21"/>
+        </w:rPr>
+        <w:t>Quando a decisão respeita à detenção de animais, o legislador nacional excluiu o deferimento tácito em termos inequívocos:</w:t>
+      </w:r>
+    </w:p>
+    <w:p>
+      <w:pPr>
+        <w:spacing w:after="40"/>
+        <w:ind w:left="454" w:right="227"/>
+      </w:pPr>
+      <w:r>
+        <w:rPr>
+          <w:i/>
+          <w:sz w:val="19"/>
+        </w:rPr>
+        <w:t>«2 - Caso não seja proferida a decisão referida no número anterior no prazo de 60 dias contados da data de receção do pedido de permissão administrativa devidamente instruído, independentemente da realização de visita de controlo, não há lugar a deferimento tácito, podendo o interessado obter a tutela adequada junto dos tribunais administrativos.»</w:t>
+      </w:r>
+    </w:p>
+    <w:p>
+      <w:pPr>
+        <w:spacing w:after="160"/>
+        <w:ind w:left="454"/>
+      </w:pPr>
+      <w:r>
+        <w:rPr>
+          <w:color w:val="555555"/>
+          <w:sz w:val="17"/>
+        </w:rPr>
+        <w:t>n.º 2 do art.º 3.º-D do Decreto-Lei n.º 276/2001, de 17 de outubro, na redação dada pelo Decreto-Lei n.º 20/2019, de 30 de janeiro. Norma vigente.</w:t>
+      </w:r>
+    </w:p>
+    <w:p>
+      <w:pPr>
+        <w:spacing w:after="120"/>
+      </w:pPr>
+      <w:r>
+        <w:rPr>
+          <w:b w:val="0"/>
+          <w:i w:val="0"/>
+          <w:sz w:val="21"/>
+        </w:rPr>
+        <w:t>A norma respeita à permissão administrativa dos alojamentos destinados à reprodução e criação de animais potencialmente perigosos, o caso em que o regime dos animais de companhia exige decisão expressa. O projeto de RGAC reproduz a solução no n.º 2 do seu art.º 47.º. Não se trata, portanto, de uma pretensão nova desta Direção de Serviços: é a solução que o ordenamento já consagra para decisões desta natureza.</w:t>
+      </w:r>
+    </w:p>
+    <w:p>
+      <w:pPr>
+        <w:spacing w:before="240" w:after="80"/>
+      </w:pPr>
+      <w:r>
+        <w:rPr>
+          <w:b/>
+          <w:color w:val="1F3B63"/>
+          <w:sz w:val="22"/>
+        </w:rPr>
+        <w:t>3.3. E o direito da União vai no mesmo sentido</w:t>
+      </w:r>
+    </w:p>
+    <w:p>
+      <w:pPr>
+        <w:spacing w:after="40"/>
+        <w:ind w:left="454" w:right="227"/>
+      </w:pPr>
+      <w:r>
+        <w:rPr>
+          <w:i/>
+          <w:sz w:val="19"/>
+        </w:rPr>
+        <w:t>«1. Operators of breeding establishments that either produce or intend to produce more than five litters per calendar year or that keep more than a combined total of five bitches or queens at any given time shall place dogs or cats on the market only after their breeding establishment has been approved by the competent authority. 2. The competent authority shall perform on-site inspections to verify that the breeding establishment meets the requirements of this Regulation. [...] The competent authority shall grant certificates of approval only to breeding establishments that meet the requirements of this Regulation.»</w:t>
+      </w:r>
+    </w:p>
+    <w:p>
+      <w:pPr>
+        <w:spacing w:after="160"/>
+        <w:ind w:left="454"/>
+      </w:pPr>
+      <w:r>
+        <w:rPr>
+          <w:color w:val="555555"/>
+          <w:sz w:val="17"/>
+        </w:rPr>
+        <w:t>art.º 10.º, n.ºs 1 e 2, do Regulamento (UE) 2026/1818 — versão inglesa, JO L, 2026/1818, de 10.8.2026.</w:t>
+      </w:r>
+    </w:p>
+    <w:p>
+      <w:pPr>
+        <w:spacing w:after="40"/>
+        <w:ind w:left="454" w:right="227"/>
+      </w:pPr>
+      <w:r>
+        <w:rPr>
+          <w:i/>
+          <w:sz w:val="19"/>
+        </w:rPr>
+        <w:t>«1. Os operadores de estabelecimentos de criação que produzam ou tencionem produzir mais de cinco ninhadas por ano civil, ou que, a qualquer momento, detenham um total combinado de mais de cinco cadelas reprodutoras ou gatas reprodutoras, só podem colocar cães ou gatos no mercado após aprovação do seu estabelecimento de criação pela autoridade competente. 2. A autoridade competente efetua inspeções no local para verificar se o estabelecimento de criação cumpre os requisitos do presente regulamento. [...] A autoridade competente só deve conceder certificados de aprovação a estabelecimentos de criação que cumpram os requisitos do presente regulamento.»</w:t>
+      </w:r>
+    </w:p>
+    <w:p>
+      <w:pPr>
+        <w:spacing w:after="160"/>
+        <w:ind w:left="454"/>
+      </w:pPr>
+      <w:r>
+        <w:rPr>
+          <w:color w:val="555555"/>
+          <w:sz w:val="17"/>
+        </w:rPr>
+        <w:t>art.º 10.º, n.ºs 1 e 2, do Regulamento (UE) 2026/1818 — versão portuguesa.</w:t>
+      </w:r>
+    </w:p>
+    <w:p>
+      <w:pPr>
+        <w:spacing w:after="120"/>
+      </w:pPr>
+      <w:r>
+        <w:rPr>
+          <w:b w:val="0"/>
+          <w:i w:val="0"/>
+          <w:sz w:val="21"/>
+        </w:rPr>
+        <w:t>O art.º 10.º é aplicável a partir de 31 de agosto de 2034, nos termos da al. f) do art.º 33.º. Note-se a natureza da exigência: a colocação no mercado depende de aprovação, e a aprovação depende de inspeção no local, não podendo o certificado ser concedido a estabelecimento que não cumpra. Uma aprovação obtida por silêncio administrativo é incompatível com esta construção.</w:t>
+      </w:r>
+    </w:p>
+    <w:p>
+      <w:pPr>
+        <w:spacing w:before="240" w:after="80"/>
+      </w:pPr>
+      <w:r>
+        <w:rPr>
+          <w:b/>
+          <w:color w:val="1F3B63"/>
+          <w:sz w:val="22"/>
+        </w:rPr>
+        <w:t>3.4. O que o artigo 31.º revela</w:t>
+      </w:r>
+    </w:p>
+    <w:p>
+      <w:pPr>
+        <w:spacing w:after="120"/>
+      </w:pPr>
+      <w:r>
+        <w:rPr>
+          <w:b w:val="0"/>
+          <w:i w:val="0"/>
+          <w:sz w:val="21"/>
+        </w:rPr>
+        <w:t>O art.º 31.º enumera as causas de indeferimento e de não emissão do título. Entre as dezenas de circunstâncias previstas, a única referência à DGAV é a da al. f), relativa à «Decisão desfavorável quanto à atribuição do NCV ou NII», isto é, matéria de segurança da cadeia alimentar e de subprodutos. Não há qualquer causa de indeferimento fundada em pronúncia desfavorável em matéria de saúde ou de bem-estar animal, o que é coerente com a ausência da DGAV no procedimento das atividades que detêm animais de companhia, assinalada no ponto 01.</w:t>
+      </w:r>
+    </w:p>
+    <w:p>
+      <w:pPr>
+        <w:spacing w:before="240" w:after="80"/>
+      </w:pPr>
+      <w:r>
+        <w:rPr>
+          <w:b/>
+          <w:color w:val="1F3B63"/>
+          <w:sz w:val="22"/>
+        </w:rPr>
+        <w:t>3.5. Um efeito colateral fora do nosso âmbito, a sinalizar internamente</w:t>
+      </w:r>
+    </w:p>
+    <w:p>
+      <w:pPr>
+        <w:spacing w:after="120"/>
+      </w:pPr>
+      <w:r>
+        <w:rPr>
+          <w:b w:val="0"/>
+          <w:i w:val="0"/>
+          <w:sz w:val="21"/>
+        </w:rPr>
+        <w:t>O n.º 1 do art.º 14.º do anexo determina que os estabelecimentos abrangidos pelo n.º 2 do art.º 4.º do Regulamento (CE) n.º 853/2004, pelo art.º 10.º do Regulamento (CE) n.º 183/2005 e pelo art.º 44.º do Regulamento (CE) n.º 1069/2009 «só podem iniciar a atividade após realização de vistoria e aprovação pela DGAV». Conjugado com o n.º 3 do art.º 25.º e com a linha de 30 dias do Anexo III, coloca-se a questão de saber se o silêncio da DGAV pode valer como aprovação sanitária para efeitos daqueles regulamentos. A matéria é da competência dos serviços de segurança alimentar e de subprodutos, não desta Direção de Serviços, mas deve ser-lhes sinalizada.</w:t>
+      </w:r>
+    </w:p>
+    <w:p>
+      <w:pPr>
+        <w:spacing w:before="240" w:after="80"/>
+      </w:pPr>
+      <w:r>
+        <w:rPr>
+          <w:b/>
+          <w:color w:val="1F3B63"/>
+          <w:sz w:val="22"/>
+        </w:rPr>
+        <w:t>3.6. Fontes do ponto 03</w:t>
+      </w:r>
+    </w:p>
+    <w:p>
+      <w:pPr>
+        <w:pStyle w:val="ListBullet"/>
+        <w:spacing w:after="60"/>
+        <w:jc w:val="both"/>
+      </w:pPr>
+      <w:r>
+        <w:rPr>
+          <w:sz w:val="21"/>
+        </w:rPr>
+        <w:t>Projeto: preâmbulo; art.ºs 14.º, 21.º, 25.º, 29.º e 31.º do anexo; Anexo III.</w:t>
+      </w:r>
+    </w:p>
+    <w:p>
+      <w:pPr>
+        <w:pStyle w:val="ListBullet"/>
+        <w:spacing w:after="60"/>
+        <w:jc w:val="both"/>
+      </w:pPr>
+      <w:r>
+        <w:rPr>
+          <w:sz w:val="21"/>
+        </w:rPr>
+        <w:t>Decreto-Lei n.º 276/2001, de 17 de outubro — art.ºs 3.º, 3.º-B, 3.º-C e 3.º-D, n.º 2, na redação do Decreto-Lei n.º 20/2019, de 30 de janeiro.</w:t>
+      </w:r>
+    </w:p>
+    <w:p>
+      <w:pPr>
+        <w:pStyle w:val="ListBullet"/>
+        <w:spacing w:after="60"/>
+        <w:jc w:val="both"/>
+      </w:pPr>
+      <w:r>
+        <w:rPr>
+          <w:sz w:val="21"/>
+        </w:rPr>
+        <w:t>Regulamento (UE) 2026/1818 — art.º 10.º, n.ºs 1 e 2, e al. f) do art.º 33.º, nas versões inglesa e portuguesa.</w:t>
+      </w:r>
+    </w:p>
+    <w:p>
+      <w:pPr>
+        <w:pStyle w:val="ListBullet"/>
+        <w:spacing w:after="60"/>
+        <w:jc w:val="both"/>
+      </w:pPr>
+      <w:r>
+        <w:rPr>
+          <w:sz w:val="21"/>
+        </w:rPr>
+        <w:t>Projeto de RGAC — n.º 2 do art.º 47.º. Trabalho em curso, citado como tal.</w:t>
+      </w:r>
+    </w:p>
+    <w:p>
+      <w:pPr>
+        <w:spacing w:before="240" w:after="80"/>
+      </w:pPr>
+      <w:r>
+        <w:rPr>
+          <w:b/>
+          <w:color w:val="1F3B63"/>
+          <w:sz w:val="22"/>
+        </w:rPr>
+        <w:t>3.7. Verificações pendentes</w:t>
+      </w:r>
+    </w:p>
+    <w:p>
+      <w:pPr>
+        <w:pStyle w:val="ListBullet"/>
+        <w:spacing w:after="60"/>
+        <w:jc w:val="both"/>
+      </w:pPr>
+      <w:r>
+        <w:rPr>
+          <w:sz w:val="21"/>
+        </w:rPr>
+        <w:t>Confirmar se o regime geral do Código do Procedimento Administrativo e a legislação de segurança alimentar admitem, ou não, aprovação sanitária por deferimento tácito, para fundamentar o ponto 3.5.</w:t>
+      </w:r>
+    </w:p>
+    <w:p>
+      <w:pPr>
+        <w:pStyle w:val="ListBullet"/>
+        <w:spacing w:after="60"/>
+        <w:jc w:val="both"/>
+      </w:pPr>
+      <w:r>
+        <w:rPr>
+          <w:sz w:val="21"/>
+        </w:rPr>
+        <w:t>Confirmar se existe prática ou orientação da DGAV sobre prazos de pronúncia no SIR e no SI REAP que permita estimar o risco real de o prazo de 20 dias ser excedido.</w:t>
+      </w:r>
+    </w:p>
+    <w:p>
+      <w:pPr>
+        <w:spacing w:before="360" w:after="120"/>
+      </w:pPr>
+      <w:r>
+        <w:rPr>
+          <w:b/>
+          <w:color w:val="1F3B63"/>
+          <w:sz w:val="26"/>
+        </w:rPr>
         <w:t>Secção transversal — A Lei da Saúde Animal como pano de fundo</w:t>
       </w:r>
     </w:p>
@@ -4047,6 +4437,44 @@
                 <w:sz w:val="18"/>
               </w:rPr>
               <w:t>Alteração</w:t>
+            </w:r>
+          </w:p>
+        </w:tc>
+      </w:tr>
+      <w:tr>
+        <w:tc>
+          <w:tcPr>
+            <w:tcW w:type="dxa" w:w="1361"/>
+          </w:tcPr>
+          <w:p>
+            <w:pPr>
+              <w:spacing w:after="40"/>
+              <w:jc w:val="both"/>
+            </w:pPr>
+            <w:r/>
+            <w:r>
+              <w:rPr>
+                <w:sz w:val="18"/>
+              </w:rPr>
+              <w:t>6.10.2026</w:t>
+            </w:r>
+          </w:p>
+        </w:tc>
+        <w:tc>
+          <w:tcPr>
+            <w:tcW w:type="dxa" w:w="7427"/>
+          </w:tcPr>
+          <w:p>
+            <w:pPr>
+              <w:spacing w:after="40"/>
+              <w:jc w:val="both"/>
+            </w:pPr>
+            <w:r/>
+            <w:r>
+              <w:rPr>
+                <w:sz w:val="18"/>
+              </w:rPr>
+              <w:t>Fundamentação do ponto 03, sobre o deferimento tácito, com o achado de que a exclusão do deferimento tácito em decisões sobre detenção de animais já consta da lei vigente, no n.º 2 do artigo 3.º-D do Decreto-Lei n.º 276/2001, e não apenas do projeto de RGAC.</w:t>
             </w:r>
           </w:p>
         </w:tc>

</xml_diff>

<commit_message>
Série reduzida a seis pontos
Funde o antigo ponto 04, da cláusula de articulação, no ponto 01, por
tratarem do mesmo problema em normas diferentes. Elimina a venda e
publicidade em linha, o SIAC e cadastro setorial e os lapsos formais.
Renumera os restantes: errantes 04, comércio não sedentário e leilões
05, acesso de animais de companhia 06. A análise dos temas eliminados
permanece no documento.

Co-Authored-By: Claude Opus 5 <noreply@anthropic.com>
Claude-Session: https://claude.ai/code/session_01ETNym69SS49ymutsXowEHk
</commit_message>
<xml_diff>
--- a/DL 405_2026/Fundamentacao_das_Observacoes.docx
+++ b/DL 405_2026/Fundamentacao_das_Observacoes.docx
@@ -272,7 +272,7 @@
               <w:rPr>
                 <w:sz w:val="18"/>
               </w:rPr>
-              <w:t>Estabelecimentos de comércio a retalho de animais de companhia: ausência da DGAV no procedimento</w:t>
+              <w:t>A DGAV no procedimento das lojas de venda de animais de companhia e a articulação com o regime dos animais de companhia e com a Lei da Saúde Animal</w:t>
             </w:r>
           </w:p>
         </w:tc>
@@ -290,7 +290,7 @@
               <w:rPr>
                 <w:sz w:val="18"/>
               </w:rPr>
-              <w:t>Art.º 16.º, n.º 4, e Anexo II</w:t>
+              <w:t>Art.º 16.º, n.º 4, e Anexo II; art.ºs 2.º e 36.º, n.º 3</w:t>
             </w:r>
           </w:p>
         </w:tc>
@@ -308,7 +308,7 @@
               <w:rPr>
                 <w:sz w:val="18"/>
               </w:rPr>
-              <w:t>Fechado</w:t>
+              <w:t>A refazer, em fusão</w:t>
             </w:r>
           </w:p>
         </w:tc>
@@ -346,7 +346,7 @@
               <w:rPr>
                 <w:sz w:val="18"/>
               </w:rPr>
-              <w:t>Animais de companhia na definição de atividade pecuária: a exclusão eliminada</w:t>
+              <w:t>Animais de companhia na definição de atividade pecuária: qual a norma de bem-estar aplicável</w:t>
             </w:r>
           </w:p>
         </w:tc>
@@ -494,80 +494,6 @@
               <w:rPr>
                 <w:sz w:val="18"/>
               </w:rPr>
-              <w:t>Cláusula de articulação com o regime dos animais de companhia e com o Regulamento</w:t>
-            </w:r>
-          </w:p>
-        </w:tc>
-        <w:tc>
-          <w:tcPr>
-            <w:tcW w:type="dxa" w:w="2438"/>
-          </w:tcPr>
-          <w:p>
-            <w:pPr>
-              <w:spacing w:after="40"/>
-              <w:jc w:val="both"/>
-            </w:pPr>
-            <w:r/>
-            <w:r>
-              <w:rPr>
-                <w:sz w:val="18"/>
-              </w:rPr>
-              <w:t>Art.ºs 2.º e 36.º, n.º 3</w:t>
-            </w:r>
-          </w:p>
-        </w:tc>
-        <w:tc>
-          <w:tcPr>
-            <w:tcW w:type="dxa" w:w="1134"/>
-          </w:tcPr>
-          <w:p>
-            <w:pPr>
-              <w:spacing w:after="40"/>
-              <w:jc w:val="both"/>
-            </w:pPr>
-            <w:r/>
-            <w:r>
-              <w:rPr>
-                <w:sz w:val="18"/>
-              </w:rPr>
-              <w:t>Previsto</w:t>
-            </w:r>
-          </w:p>
-        </w:tc>
-      </w:tr>
-      <w:tr>
-        <w:tc>
-          <w:tcPr>
-            <w:tcW w:type="dxa" w:w="567"/>
-          </w:tcPr>
-          <w:p>
-            <w:pPr>
-              <w:spacing w:after="40"/>
-              <w:jc w:val="both"/>
-            </w:pPr>
-            <w:r/>
-            <w:r>
-              <w:rPr>
-                <w:sz w:val="18"/>
-              </w:rPr>
-              <w:t>05</w:t>
-            </w:r>
-          </w:p>
-        </w:tc>
-        <w:tc>
-          <w:tcPr>
-            <w:tcW w:type="dxa" w:w="3515"/>
-          </w:tcPr>
-          <w:p>
-            <w:pPr>
-              <w:spacing w:after="40"/>
-              <w:jc w:val="both"/>
-            </w:pPr>
-            <w:r/>
-            <w:r>
-              <w:rPr>
-                <w:sz w:val="18"/>
-              </w:rPr>
               <w:t>Recolha de animais errantes: delimitação às espécies pecuárias</w:t>
             </w:r>
           </w:p>
@@ -624,7 +550,7 @@
               <w:rPr>
                 <w:sz w:val="18"/>
               </w:rPr>
-              <w:t>06</w:t>
+              <w:t>05</w:t>
             </w:r>
           </w:p>
         </w:tc>
@@ -698,81 +624,7 @@
               <w:rPr>
                 <w:sz w:val="18"/>
               </w:rPr>
-              <w:t>07</w:t>
-            </w:r>
-          </w:p>
-        </w:tc>
-        <w:tc>
-          <w:tcPr>
-            <w:tcW w:type="dxa" w:w="3515"/>
-          </w:tcPr>
-          <w:p>
-            <w:pPr>
-              <w:spacing w:after="40"/>
-              <w:jc w:val="both"/>
-            </w:pPr>
-            <w:r/>
-            <w:r>
-              <w:rPr>
-                <w:sz w:val="18"/>
-              </w:rPr>
-              <w:t>Venda e publicidade em linha</w:t>
-            </w:r>
-          </w:p>
-        </w:tc>
-        <w:tc>
-          <w:tcPr>
-            <w:tcW w:type="dxa" w:w="2438"/>
-          </w:tcPr>
-          <w:p>
-            <w:pPr>
-              <w:spacing w:after="40"/>
-              <w:jc w:val="both"/>
-            </w:pPr>
-            <w:r/>
-            <w:r>
-              <w:rPr>
-                <w:sz w:val="18"/>
-              </w:rPr>
-              <w:t>Art.º 1.º, n.º 4</w:t>
-            </w:r>
-          </w:p>
-        </w:tc>
-        <w:tc>
-          <w:tcPr>
-            <w:tcW w:type="dxa" w:w="1134"/>
-          </w:tcPr>
-          <w:p>
-            <w:pPr>
-              <w:spacing w:after="40"/>
-              <w:jc w:val="both"/>
-            </w:pPr>
-            <w:r/>
-            <w:r>
-              <w:rPr>
-                <w:sz w:val="18"/>
-              </w:rPr>
-              <w:t>Previsto</w:t>
-            </w:r>
-          </w:p>
-        </w:tc>
-      </w:tr>
-      <w:tr>
-        <w:tc>
-          <w:tcPr>
-            <w:tcW w:type="dxa" w:w="567"/>
-          </w:tcPr>
-          <w:p>
-            <w:pPr>
-              <w:spacing w:after="40"/>
-              <w:jc w:val="both"/>
-            </w:pPr>
-            <w:r/>
-            <w:r>
-              <w:rPr>
-                <w:sz w:val="18"/>
-              </w:rPr>
-              <w:t>08</w:t>
+              <w:t>06</w:t>
             </w:r>
           </w:p>
         </w:tc>
@@ -831,154 +683,6 @@
           </w:p>
         </w:tc>
       </w:tr>
-      <w:tr>
-        <w:tc>
-          <w:tcPr>
-            <w:tcW w:type="dxa" w:w="567"/>
-          </w:tcPr>
-          <w:p>
-            <w:pPr>
-              <w:spacing w:after="40"/>
-              <w:jc w:val="both"/>
-            </w:pPr>
-            <w:r/>
-            <w:r>
-              <w:rPr>
-                <w:sz w:val="18"/>
-              </w:rPr>
-              <w:t>09</w:t>
-            </w:r>
-          </w:p>
-        </w:tc>
-        <w:tc>
-          <w:tcPr>
-            <w:tcW w:type="dxa" w:w="3515"/>
-          </w:tcPr>
-          <w:p>
-            <w:pPr>
-              <w:spacing w:after="40"/>
-              <w:jc w:val="both"/>
-            </w:pPr>
-            <w:r/>
-            <w:r>
-              <w:rPr>
-                <w:sz w:val="18"/>
-              </w:rPr>
-              <w:t>SIAC, base de dados setorial e cadastro</w:t>
-            </w:r>
-          </w:p>
-        </w:tc>
-        <w:tc>
-          <w:tcPr>
-            <w:tcW w:type="dxa" w:w="2438"/>
-          </w:tcPr>
-          <w:p>
-            <w:pPr>
-              <w:spacing w:after="40"/>
-              <w:jc w:val="both"/>
-            </w:pPr>
-            <w:r/>
-            <w:r>
-              <w:rPr>
-                <w:sz w:val="18"/>
-              </w:rPr>
-              <w:t>Art.ºs 198.º a 200.º</w:t>
-            </w:r>
-          </w:p>
-        </w:tc>
-        <w:tc>
-          <w:tcPr>
-            <w:tcW w:type="dxa" w:w="1134"/>
-          </w:tcPr>
-          <w:p>
-            <w:pPr>
-              <w:spacing w:after="40"/>
-              <w:jc w:val="both"/>
-            </w:pPr>
-            <w:r/>
-            <w:r>
-              <w:rPr>
-                <w:sz w:val="18"/>
-              </w:rPr>
-              <w:t>Previsto</w:t>
-            </w:r>
-          </w:p>
-        </w:tc>
-      </w:tr>
-      <w:tr>
-        <w:tc>
-          <w:tcPr>
-            <w:tcW w:type="dxa" w:w="567"/>
-          </w:tcPr>
-          <w:p>
-            <w:pPr>
-              <w:spacing w:after="40"/>
-              <w:jc w:val="both"/>
-            </w:pPr>
-            <w:r/>
-            <w:r>
-              <w:rPr>
-                <w:sz w:val="18"/>
-              </w:rPr>
-              <w:t>10</w:t>
-            </w:r>
-          </w:p>
-        </w:tc>
-        <w:tc>
-          <w:tcPr>
-            <w:tcW w:type="dxa" w:w="3515"/>
-          </w:tcPr>
-          <w:p>
-            <w:pPr>
-              <w:spacing w:after="40"/>
-              <w:jc w:val="both"/>
-            </w:pPr>
-            <w:r/>
-            <w:r>
-              <w:rPr>
-                <w:sz w:val="18"/>
-              </w:rPr>
-              <w:t>Lapsos formais com efeito material</w:t>
-            </w:r>
-          </w:p>
-        </w:tc>
-        <w:tc>
-          <w:tcPr>
-            <w:tcW w:type="dxa" w:w="2438"/>
-          </w:tcPr>
-          <w:p>
-            <w:pPr>
-              <w:spacing w:after="40"/>
-              <w:jc w:val="both"/>
-            </w:pPr>
-            <w:r/>
-            <w:r>
-              <w:rPr>
-                <w:sz w:val="18"/>
-              </w:rPr>
-              <w:t>Anexo V; numeração da Secção III</w:t>
-            </w:r>
-          </w:p>
-        </w:tc>
-        <w:tc>
-          <w:tcPr>
-            <w:tcW w:type="dxa" w:w="1134"/>
-          </w:tcPr>
-          <w:p>
-            <w:pPr>
-              <w:spacing w:after="40"/>
-              <w:jc w:val="both"/>
-            </w:pPr>
-            <w:r/>
-            <w:r>
-              <w:rPr>
-                <w:sz w:val="18"/>
-              </w:rPr>
-              <w:t>Previsto</w:t>
-            </w:r>
-          </w:p>
-        </w:tc>
-      </w:tr>
     </w:tbl>
     <w:p>
       <w:pPr>
@@ -996,7 +700,21 @@
           <w:color w:val="555555"/>
           <w:sz w:val="19"/>
         </w:rPr>
-        <w:t>Nota sobre a renumeração: a ordem seguida na primeira análise global, registada no contributo interno de 5 de outubro de 2026, era diferente. O tema que ali figurava como ponto 6, sobre a fronteira entre detenção caseira e animal de companhia, passou a ser o ponto 02 desta série e absorveu aquele. Os restantes desceram uma posição.</w:t>
+        <w:t>Notas sobre a numeração. A ordem da primeira análise global, registada no contributo interno de 5 de outubro de 2026, era diferente: o tema que ali figurava como ponto 6, sobre a fronteira entre detenção caseira e animal de companhia, passou a ser o ponto 02 e absorveu-o.</w:t>
+      </w:r>
+    </w:p>
+    <w:p>
+      <w:pPr>
+        <w:spacing w:after="120"/>
+      </w:pPr>
+      <w:r>
+        <w:rPr>
+          <w:b w:val="0"/>
+          <w:i w:val="0"/>
+          <w:color w:val="555555"/>
+          <w:sz w:val="19"/>
+        </w:rPr>
+        <w:t>Por decisão de 6 de outubro de 2026, a série foi reduzida. O antigo ponto 04, sobre a cláusula de articulação, foi fundido no ponto 01, por tratarem do mesmo problema em normas diferentes e por as correções pedidas serem complementares. Foram eliminados três temas: a venda e publicidade em linha, por o art.º 21.º do Regulamento (UE) 2026/1818 assegurar o essencial e o projeto não o contrariar; o SIAC, a base de dados setorial e o cadastro, por ser matéria de execução e de médio prazo; e os lapsos formais, por não serem matéria desta Direção de Serviços. A análise de cada um permanece neste documento, para o caso de virem a ser retomados.</w:t>
       </w:r>
     </w:p>
     <w:p>
@@ -4437,6 +4155,44 @@
                 <w:sz w:val="18"/>
               </w:rPr>
               <w:t>Alteração</w:t>
+            </w:r>
+          </w:p>
+        </w:tc>
+      </w:tr>
+      <w:tr>
+        <w:tc>
+          <w:tcPr>
+            <w:tcW w:type="dxa" w:w="1361"/>
+          </w:tcPr>
+          <w:p>
+            <w:pPr>
+              <w:spacing w:after="40"/>
+              <w:jc w:val="both"/>
+            </w:pPr>
+            <w:r/>
+            <w:r>
+              <w:rPr>
+                <w:sz w:val="18"/>
+              </w:rPr>
+              <w:t>6.10.2026</w:t>
+            </w:r>
+          </w:p>
+        </w:tc>
+        <w:tc>
+          <w:tcPr>
+            <w:tcW w:type="dxa" w:w="7427"/>
+          </w:tcPr>
+          <w:p>
+            <w:pPr>
+              <w:spacing w:after="40"/>
+              <w:jc w:val="both"/>
+            </w:pPr>
+            <w:r/>
+            <w:r>
+              <w:rPr>
+                <w:sz w:val="18"/>
+              </w:rPr>
+              <w:t>Série reduzida a seis pontos. Fusão do antigo ponto 04 no ponto 01 e eliminação dos temas da venda em linha, do SIAC e cadastro e dos lapsos formais. Renumerados os restantes: os errantes passam a 04, o comércio não sedentário e os leilões a 05 e o acesso de animais de companhia a estabelecimentos a 06.</w:t>
             </w:r>
           </w:p>
         </w:tc>

</xml_diff>

<commit_message>
Série em cinco pontos: cai a venda não sedentária, feiras e leilões
Apurado que a omissão dos animais vivos no n.º 2 do artigo 133.º é cópia
literal do n.º 2 do artigo 75.º do DL 10/2015 e que a proibição tem sede
própria desde 2003 no n.º 6 do artigo 35.º do DL 276/2001. Não há
regressão nem decisão neste projeto: no ficheiro não existe eliminação
nem comentário sobre o tema.

Resíduos no novo ponto 5-R: o vazio quanto aos leilões de animais, a
remissão do n.º 2 do artigo 11.º do RGAC para o DL 10/2015 ora revogado,
que é correção nossa, e a hipótese não confirmada sobre a lista anexa ao
DL 122/79.

Co-Authored-By: Claude Opus 5 <noreply@anthropic.com>
Claude-Session: https://claude.ai/code/session_01ETNym69SS49ymutsXowEHk
</commit_message>
<xml_diff>
--- a/DL 405_2026/Fundamentacao_das_Observacoes.docx
+++ b/DL 405_2026/Fundamentacao_das_Observacoes.docx
@@ -456,7 +456,7 @@
               <w:rPr>
                 <w:sz w:val="18"/>
               </w:rPr>
-              <w:t>Fechado</w:t>
+              <w:t>A confirmar</w:t>
             </w:r>
           </w:p>
         </w:tc>
@@ -494,7 +494,7 @@
               <w:rPr>
                 <w:sz w:val="18"/>
               </w:rPr>
-              <w:t>Recolha de animais errantes: delimitação às espécies pecuárias</w:t>
+              <w:t>Recolha de animais errantes: delimitação às espécies pecuárias. É a questão que originou o pedido de pronúncia</w:t>
             </w:r>
           </w:p>
         </w:tc>
@@ -568,80 +568,6 @@
               <w:rPr>
                 <w:sz w:val="18"/>
               </w:rPr>
-              <w:t>Venda em comércio não sedentário, feiras e leilões: falta de articulação</w:t>
-            </w:r>
-          </w:p>
-        </w:tc>
-        <w:tc>
-          <w:tcPr>
-            <w:tcW w:type="dxa" w:w="2438"/>
-          </w:tcPr>
-          <w:p>
-            <w:pPr>
-              <w:spacing w:after="40"/>
-              <w:jc w:val="both"/>
-            </w:pPr>
-            <w:r/>
-            <w:r>
-              <w:rPr>
-                <w:sz w:val="18"/>
-              </w:rPr>
-              <w:t>Art.ºs 133.º, n.º 2, e 153.º, n.º 1</w:t>
-            </w:r>
-          </w:p>
-        </w:tc>
-        <w:tc>
-          <w:tcPr>
-            <w:tcW w:type="dxa" w:w="1134"/>
-          </w:tcPr>
-          <w:p>
-            <w:pPr>
-              <w:spacing w:after="40"/>
-              <w:jc w:val="both"/>
-            </w:pPr>
-            <w:r/>
-            <w:r>
-              <w:rPr>
-                <w:sz w:val="18"/>
-              </w:rPr>
-              <w:t>Previsto</w:t>
-            </w:r>
-          </w:p>
-        </w:tc>
-      </w:tr>
-      <w:tr>
-        <w:tc>
-          <w:tcPr>
-            <w:tcW w:type="dxa" w:w="567"/>
-          </w:tcPr>
-          <w:p>
-            <w:pPr>
-              <w:spacing w:after="40"/>
-              <w:jc w:val="both"/>
-            </w:pPr>
-            <w:r/>
-            <w:r>
-              <w:rPr>
-                <w:sz w:val="18"/>
-              </w:rPr>
-              <w:t>06</w:t>
-            </w:r>
-          </w:p>
-        </w:tc>
-        <w:tc>
-          <w:tcPr>
-            <w:tcW w:type="dxa" w:w="3515"/>
-          </w:tcPr>
-          <w:p>
-            <w:pPr>
-              <w:spacing w:after="40"/>
-              <w:jc w:val="both"/>
-            </w:pPr>
-            <w:r/>
-            <w:r>
-              <w:rPr>
-                <w:sz w:val="18"/>
-              </w:rPr>
               <w:t>Acesso de animais de companhia a estabelecimentos</w:t>
             </w:r>
           </w:p>
@@ -714,7 +640,21 @@
           <w:color w:val="555555"/>
           <w:sz w:val="19"/>
         </w:rPr>
-        <w:t>Por decisão de 6 de outubro de 2026, a série foi reduzida. O antigo ponto 04, sobre a cláusula de articulação, foi fundido no ponto 01, por tratarem do mesmo problema em normas diferentes e por as correções pedidas serem complementares. Foram eliminados três temas: a venda e publicidade em linha, por o art.º 21.º do Regulamento (UE) 2026/1818 assegurar o essencial e o projeto não o contrariar; o SIAC, a base de dados setorial e o cadastro, por ser matéria de execução e de médio prazo; e os lapsos formais, por não serem matéria desta Direção de Serviços. A análise de cada um permanece neste documento, para o caso de virem a ser retomados.</w:t>
+        <w:t>Por decisão de 6 de outubro de 2026, a série foi reduzida a cinco pontos. O antigo ponto 04, sobre a cláusula de articulação, foi fundido no ponto 01, por tratarem do mesmo problema em normas diferentes e por as correções pedidas serem complementares. Foram eliminados três temas: a venda e publicidade em linha, por o art.º 21.º do Regulamento (UE) 2026/1818 assegurar o essencial e o projeto não o contrariar; o SIAC, a base de dados setorial e o cadastro, por ser matéria de execução e de médio prazo; e os lapsos formais, por não serem matéria desta Direção de Serviços. A análise de cada um permanece neste documento, para o caso de virem a ser retomados.</w:t>
+      </w:r>
+    </w:p>
+    <w:p>
+      <w:pPr>
+        <w:spacing w:after="120"/>
+      </w:pPr>
+      <w:r>
+        <w:rPr>
+          <w:b w:val="0"/>
+          <w:i w:val="0"/>
+          <w:color w:val="555555"/>
+          <w:sz w:val="19"/>
+        </w:rPr>
+        <w:t>Na mesma data caiu também o ponto da venda em comércio não sedentário, em feiras e em leilões. A investigação da omissão dos animais vivos no n.º 2 do art.º 133.º concluiu que não há regressão: a norma reproduz literalmente o n.º 2 do art.º 75.º do Decreto-Lei n.º 10/2015 e a proibição tem sede própria, desde 2003, no n.º 6 do art.º 35.º do Decreto-Lei n.º 276/2001. Do tema restam dois resíduos, registados no ponto 5-R: o vazio quanto aos leilões de animais e uma correção que é nossa, no projeto de RGAC.</w:t>
       </w:r>
     </w:p>
     <w:p>
@@ -3767,6 +3707,188 @@
           <w:color w:val="1F3B63"/>
           <w:sz w:val="26"/>
         </w:rPr>
+        <w:t>Ponto 5-R — Resíduos do tema eliminado da venda não sedentária, feiras e leilões</w:t>
+      </w:r>
+    </w:p>
+    <w:p>
+      <w:pPr>
+        <w:spacing w:before="240" w:after="80"/>
+      </w:pPr>
+      <w:r>
+        <w:rPr>
+          <w:b/>
+          <w:color w:val="1F3B63"/>
+          <w:sz w:val="22"/>
+        </w:rPr>
+        <w:t>5R.1. Por que razão o tema caiu</w:t>
+      </w:r>
+    </w:p>
+    <w:p>
+      <w:pPr>
+        <w:spacing w:after="120"/>
+      </w:pPr>
+      <w:r>
+        <w:rPr>
+          <w:b w:val="0"/>
+          <w:i w:val="0"/>
+          <w:sz w:val="21"/>
+        </w:rPr>
+        <w:t>A questão de partida era a omissão dos animais vivos no elenco de proibições do n.º 2 do art.º 133.º do anexo. A investigação concluiu que não houve decisão neste projeto nem regressão face ao regime vigente.</w:t>
+      </w:r>
+    </w:p>
+    <w:p>
+      <w:pPr>
+        <w:pStyle w:val="ListBullet"/>
+        <w:spacing w:after="60"/>
+        <w:jc w:val="both"/>
+      </w:pPr>
+      <w:r>
+        <w:rPr>
+          <w:sz w:val="21"/>
+        </w:rPr>
+        <w:t>No ficheiro não há qualquer eliminação de texto relativa a animais no art.º 133.º, nem comentário ancorado ao artigo. A única alteração registada em todo o artigo é a eliminação da expressão «, na sua redação atual» na al. a) do n.º 2, em nome de Maria João Torres, com data de 1.9.2026.</w:t>
+      </w:r>
+    </w:p>
+    <w:p>
+      <w:pPr>
+        <w:pStyle w:val="ListBullet"/>
+        <w:spacing w:after="60"/>
+        <w:jc w:val="both"/>
+      </w:pPr>
+      <w:r>
+        <w:rPr>
+          <w:sz w:val="21"/>
+        </w:rPr>
+        <w:t>O n.º 2 do art.º 133.º reproduz literalmente o n.º 2 do art.º 75.º do Decreto-Lei n.º 10/2015, de 16 de janeiro: as mesmas sete alíneas, na mesma ordem e com a mesma redação. A omissão é herdada de 2015.</w:t>
+      </w:r>
+    </w:p>
+    <w:p>
+      <w:pPr>
+        <w:pStyle w:val="ListBullet"/>
+        <w:spacing w:after="60"/>
+        <w:jc w:val="both"/>
+      </w:pPr>
+      <w:r>
+        <w:rPr>
+          <w:sz w:val="21"/>
+        </w:rPr>
+        <w:t>Em 2015 a matéria já tinha sede própria. O n.º 6 do art.º 35.º do Decreto-Lei n.º 276/2001, na redação do Decreto-Lei n.º 315/2003, de 17 de dezembro, dispõe que «não é permitida a venda ambulante de animais de companhia», no mesmo artigo que fixa as condições da venda em feiras e mercados.</w:t>
+      </w:r>
+    </w:p>
+    <w:p>
+      <w:pPr>
+        <w:pStyle w:val="ListBullet"/>
+        <w:spacing w:after="60"/>
+        <w:jc w:val="both"/>
+      </w:pPr>
+      <w:r>
+        <w:rPr>
+          <w:sz w:val="21"/>
+        </w:rPr>
+        <w:t>O critério do elenco é coerente: fitofarmacêuticos, medicamentos, aditivos para alimentação animal, armas e explosivos, combustíveis, moedas e notas e veículos são produtos cuja venda fora de estabelecimento envolve risco de segurança ou de saúde pública. O animal não é um produto e o fundamento da proibição é o bem-estar, matéria de outro diploma.</w:t>
+      </w:r>
+    </w:p>
+    <w:p>
+      <w:pPr>
+        <w:spacing w:before="240" w:after="80"/>
+      </w:pPr>
+      <w:r>
+        <w:rPr>
+          <w:b/>
+          <w:color w:val="1F3B63"/>
+          <w:sz w:val="22"/>
+        </w:rPr>
+        <w:t>5R.2. Primeiro resíduo: os leilões</w:t>
+      </w:r>
+    </w:p>
+    <w:p>
+      <w:pPr>
+        <w:spacing w:after="120"/>
+      </w:pPr>
+      <w:r>
+        <w:rPr>
+          <w:b w:val="0"/>
+          <w:i w:val="0"/>
+          <w:sz w:val="21"/>
+        </w:rPr>
+        <w:t>O n.º 1 do art.º 153.º do anexo define a atividade leiloeira como a venda «de bens móveis e imóveis, corpóreos e incorpóreos ou de animais», sujeita a comunicação prévia, com a DGDCCS como entidade coordenadora e sem requisito algum de identificação, registo ou informação ao adquirente. A pesquisa das expressões «leilão» e «leiloeira» no Decreto-Lei n.º 276/2001 não devolve ocorrências: o leilão de animais de companhia não está regulado do lado do bem-estar. A partir de 31 de agosto de 2030 o n.º 3 do art.º 21.º do Regulamento (UE) 2026/1818 obriga quem coloca um cão ou gato no mercado a facultar ao adquirente prova da identificação e do registo, bem como a espécie, o sexo, a data e o país de nascimento e, se for o caso, a raça.</w:t>
+      </w:r>
+    </w:p>
+    <w:p>
+      <w:pPr>
+        <w:spacing w:after="120"/>
+      </w:pPr>
+      <w:r>
+        <w:rPr>
+          <w:b w:val="0"/>
+          <w:i w:val="0"/>
+          <w:sz w:val="21"/>
+        </w:rPr>
+        <w:t>Verificação pendente: se os Decretos-Leis n.ºs 155/2015 e 160/2015, que este projeto revoga e que regulavam a atividade leiloeira e a prestamista, continham disposição sobre animais. Se continham, há regressão; se não, o vazio é antigo e apenas se consolida.</w:t>
+      </w:r>
+    </w:p>
+    <w:p>
+      <w:pPr>
+        <w:spacing w:before="240" w:after="80"/>
+      </w:pPr>
+      <w:r>
+        <w:rPr>
+          <w:b/>
+          <w:color w:val="1F3B63"/>
+          <w:sz w:val="22"/>
+        </w:rPr>
+        <w:t>5R.3. Segundo resíduo: uma correção no nosso próprio texto</w:t>
+      </w:r>
+    </w:p>
+    <w:p>
+      <w:pPr>
+        <w:spacing w:after="120"/>
+      </w:pPr>
+      <w:r>
+        <w:rPr>
+          <w:b w:val="0"/>
+          <w:i w:val="0"/>
+          <w:sz w:val="21"/>
+        </w:rPr>
+        <w:t>O n.º 2 do art.º 11.º do projeto de RGAC vai além da lei vigente, ao proibir a transmissão de animais de companhia «fora dos locais autorizados para o efeito, nomeadamente na via pública ou no âmbito da atividade de comércio a retalho não sedentária, designadamente em feiras, mercados ou de modo ambulante, tal como definida no Decreto-Lei n.º 10/2015, de 16 de janeiro». A proibição é ancorada por remissão a um diploma que este projeto revoga. Se o RGAC for publicado nestes termos, nasce com remissão para norma revogada. É matéria a corrigir no nosso texto, e segue para o memorando de acompanhamento, não para a pronúncia.</w:t>
+      </w:r>
+    </w:p>
+    <w:p>
+      <w:pPr>
+        <w:spacing w:before="240" w:after="80"/>
+      </w:pPr>
+      <w:r>
+        <w:rPr>
+          <w:b/>
+          <w:color w:val="1F3B63"/>
+          <w:sz w:val="22"/>
+        </w:rPr>
+        <w:t>5R.4. Hipótese não confirmada</w:t>
+      </w:r>
+    </w:p>
+    <w:p>
+      <w:pPr>
+        <w:spacing w:after="120"/>
+      </w:pPr>
+      <w:r>
+        <w:rPr>
+          <w:b w:val="0"/>
+          <w:i w:val="0"/>
+          <w:sz w:val="21"/>
+        </w:rPr>
+        <w:t>Antes do Decreto-Lei n.º 10/2015, a venda ambulante regia-se pelo Decreto-Lei n.º 122/79, de 8 de maio, cujo art.º 7.º não enumerava os produtos no corpo da lei, remetendo para lista anexa alterável por despacho. Há indicação de que essa lista, e os regulamentos municipais que nela se apoiavam, abrangiam aves e outros animais de criação. Sendo assim, o elenco de 2015 poderá ter deixado cair a proibição quanto às espécies pecuárias, que o Decreto-Lei n.º 276/2001 não alcança por excluir do seu âmbito «as espécies de pecuária». Não foi possível confirmar: o acesso à fonte foi recusado com erro 403. A confirmar-se, o tema ligar-se-ia ao ponto 02 e justificaria a sua reabertura.</w:t>
+      </w:r>
+    </w:p>
+    <w:p>
+      <w:pPr>
+        <w:spacing w:before="360" w:after="120"/>
+      </w:pPr>
+      <w:r>
+        <w:rPr>
+          <w:b/>
+          <w:color w:val="1F3B63"/>
+          <w:sz w:val="26"/>
+        </w:rPr>
         <w:t>Secção transversal — A Lei da Saúde Animal como pano de fundo</w:t>
       </w:r>
     </w:p>
@@ -4155,6 +4277,44 @@
                 <w:sz w:val="18"/>
               </w:rPr>
               <w:t>Alteração</w:t>
+            </w:r>
+          </w:p>
+        </w:tc>
+      </w:tr>
+      <w:tr>
+        <w:tc>
+          <w:tcPr>
+            <w:tcW w:type="dxa" w:w="1361"/>
+          </w:tcPr>
+          <w:p>
+            <w:pPr>
+              <w:spacing w:after="40"/>
+              <w:jc w:val="both"/>
+            </w:pPr>
+            <w:r/>
+            <w:r>
+              <w:rPr>
+                <w:sz w:val="18"/>
+              </w:rPr>
+              <w:t>6.10.2026</w:t>
+            </w:r>
+          </w:p>
+        </w:tc>
+        <w:tc>
+          <w:tcPr>
+            <w:tcW w:type="dxa" w:w="7427"/>
+          </w:tcPr>
+          <w:p>
+            <w:pPr>
+              <w:spacing w:after="40"/>
+              <w:jc w:val="both"/>
+            </w:pPr>
+            <w:r/>
+            <w:r>
+              <w:rPr>
+                <w:sz w:val="18"/>
+              </w:rPr>
+              <w:t>Eliminado o ponto da venda não sedentária, feiras e leilões, apurado que a omissão dos animais vivos no n.º 2 do artigo 133.º é herdada do artigo 75.º do Decreto-Lei n.º 10/2015 e não constitui regressão. Resíduos registados no ponto 5-R. O acesso de animais de companhia a estabelecimentos passa a ponto 05. O ponto 03 passa a «a confirmar».</w:t>
             </w:r>
           </w:p>
         </w:tc>

</xml_diff>

<commit_message>
Fundamentação do ponto 04: errantes e centros de recolha oficial
Registo do regime vigente dos CRO (DL 276/2001, DL 314/2003, Lei
27/2016, Portaria 146/2017), do quadro de funções e dos quatro prazos em
presença — oito dias de permanência mínima, quinze para a presunção de
abandono, dez no RGAC e cinco úteis no projeto — e dos três pontos em
que o projeto toca os CRO.

Fixa a postura do ponto: a pronúncia não discute a sede da matéria nem
faz crítica de técnica legislativa, que passam a registo interno. O
contributo é a solução do recinto multiespécie, já prevista no RGAC e já
exigida como requisito mínimo nos Avisos de financiamento, cujo texto
fica como verificação pendente.

Co-Authored-By: Claude Opus 5 <noreply@anthropic.com>
Claude-Session: https://claude.ai/code/session_01ETNym69SS49ymutsXowEHk
</commit_message>
<xml_diff>
--- a/DL 405_2026/Fundamentacao_das_Observacoes.docx
+++ b/DL 405_2026/Fundamentacao_das_Observacoes.docx
@@ -494,7 +494,7 @@
               <w:rPr>
                 <w:sz w:val="18"/>
               </w:rPr>
-              <w:t>Recolha de animais errantes: delimitação às espécies pecuárias. É a questão que originou o pedido de pronúncia</w:t>
+              <w:t>Animais errantes e articulação com os centros de recolha oficial. É a questão que originou o pedido de pronúncia</w:t>
             </w:r>
           </w:p>
         </w:tc>
@@ -530,7 +530,7 @@
               <w:rPr>
                 <w:sz w:val="18"/>
               </w:rPr>
-              <w:t>Previsto</w:t>
+              <w:t>Em preparação</w:t>
             </w:r>
           </w:p>
         </w:tc>
@@ -3707,6 +3707,987 @@
           <w:color w:val="1F3B63"/>
           <w:sz w:val="26"/>
         </w:rPr>
+        <w:t>Ponto 04 — Animais errantes e articulação com os centros de recolha oficial</w:t>
+      </w:r>
+    </w:p>
+    <w:p>
+      <w:pPr>
+        <w:spacing w:before="240" w:after="80"/>
+      </w:pPr>
+      <w:r>
+        <w:rPr>
+          <w:b/>
+          <w:color w:val="1F3B63"/>
+          <w:sz w:val="22"/>
+        </w:rPr>
+        <w:t>4.0. Postura definida para este ponto</w:t>
+      </w:r>
+    </w:p>
+    <w:p>
+      <w:pPr>
+        <w:spacing w:after="120"/>
+      </w:pPr>
+      <w:r>
+        <w:rPr>
+          <w:b w:val="0"/>
+          <w:i/>
+          <w:sz w:val="21"/>
+        </w:rPr>
+        <w:t>Por decisão de 6 de outubro de 2026, a pronúncia neste ponto obedece a três limites.</w:t>
+      </w:r>
+    </w:p>
+    <w:p>
+      <w:pPr>
+        <w:pStyle w:val="ListBullet"/>
+        <w:spacing w:after="60"/>
+        <w:jc w:val="both"/>
+      </w:pPr>
+      <w:r>
+        <w:rPr>
+          <w:sz w:val="21"/>
+        </w:rPr>
+        <w:t>Não se discute a arquitetura do diploma nem a sede da matéria. A construção do projeto não é desta Direção de Serviços e as razões da inclusão do artigo são de quem o redigiu. A análise da sede, registada no ponto 4.3, serve apenas para compreender o raciocínio e sustentar posição, não para ser invocada.</w:t>
+      </w:r>
+    </w:p>
+    <w:p>
+      <w:pPr>
+        <w:pStyle w:val="ListBullet"/>
+        <w:spacing w:after="60"/>
+        <w:jc w:val="both"/>
+      </w:pPr>
+      <w:r>
+        <w:rPr>
+          <w:sz w:val="21"/>
+        </w:rPr>
+        <w:t>Não se faz crítica de técnica legislativa. Os lapsos de remissão e a numeração ficam registados no ponto 4.6 e são matéria dos juristas.</w:t>
+      </w:r>
+    </w:p>
+    <w:p>
+      <w:pPr>
+        <w:pStyle w:val="ListBullet"/>
+        <w:spacing w:after="60"/>
+        <w:jc w:val="both"/>
+      </w:pPr>
+      <w:r>
+        <w:rPr>
+          <w:sz w:val="21"/>
+        </w:rPr>
+        <w:t>O contributo é o que esta divisão tem a oferecer: o conhecimento dos centros de recolha oficial, a solução do recinto multiespécie e a experiência dos apoios públicos. A perspetiva é pró-animal; o registo é de imparcialidade técnica.</w:t>
+      </w:r>
+    </w:p>
+    <w:p>
+      <w:pPr>
+        <w:spacing w:before="240" w:after="80"/>
+      </w:pPr>
+      <w:r>
+        <w:rPr>
+          <w:b/>
+          <w:color w:val="1F3B63"/>
+          <w:sz w:val="22"/>
+        </w:rPr>
+        <w:t>4.1. O regime vigente dos centros de recolha oficial</w:t>
+      </w:r>
+    </w:p>
+    <w:p>
+      <w:pPr>
+        <w:spacing w:after="120"/>
+      </w:pPr>
+      <w:r>
+        <w:rPr>
+          <w:b w:val="0"/>
+          <w:i w:val="0"/>
+          <w:sz w:val="21"/>
+        </w:rPr>
+        <w:t>O centro de recolha oficial é, juridicamente, um alojamento de animais de companhia. A al. t) do n.º 1 do art.º 2.º do Decreto-Lei n.º 276/2001 define «centro de recolha» como «qualquer alojamento oficial onde um animal é hospedado por um período determinado pela autoridade competente, nomeadamente os canis e os gatis municipais», e a al. a) do n.º 1 do art.º 3.º do mesmo diploma inclui expressamente os centros de recolha entre as atividades dependentes de mera comunicação prévia à DGAV. É, por isso, um estabelecimento registado na DGAV, com médico-veterinário responsável e sujeito às normas do seu Capítulo III.</w:t>
+      </w:r>
+    </w:p>
+    <w:p>
+      <w:pPr>
+        <w:spacing w:after="120"/>
+      </w:pPr>
+      <w:r>
+        <w:rPr>
+          <w:b w:val="0"/>
+          <w:i w:val="0"/>
+          <w:sz w:val="21"/>
+        </w:rPr>
+        <w:t>A obrigação de o manter está no art.º 11.º do Decreto-Lei n.º 314/2003: as câmaras municipais, isoladamente ou em associação, «são obrigadas a possuir e manter instalações destinadas a canis e gatis, de acordo com as necessidades da zona», com pelo menos duas celas semicirculares para isolamento e quarentena de suspeitos de raiva, podendo celebrar protocolos com municípios vizinhos, e com a direção a cargo do médico-veterinário municipal. A rede resulta do n.º 4 do art.º 2.º da Lei n.º 27/2016.</w:t>
+      </w:r>
+    </w:p>
+    <w:p>
+      <w:pPr>
+        <w:spacing w:before="240" w:after="80"/>
+      </w:pPr>
+      <w:r>
+        <w:rPr>
+          <w:b/>
+          <w:color w:val="1F3B63"/>
+          <w:sz w:val="22"/>
+        </w:rPr>
+        <w:t>4.2. Funções e prazos</w:t>
+      </w:r>
+    </w:p>
+    <w:tbl>
+      <w:tblPr>
+        <w:tblStyle w:val="TableGrid"/>
+        <w:tblW w:type="auto" w:w="0"/>
+        <w:jc w:val="center"/>
+        <w:tblLook w:firstColumn="1" w:firstRow="1" w:lastColumn="0" w:lastRow="0" w:noHBand="0" w:noVBand="1" w:val="04A0"/>
+      </w:tblPr>
+      <w:tblGrid>
+        <w:gridCol w:w="3135"/>
+        <w:gridCol w:w="3135"/>
+        <w:gridCol w:w="3135"/>
+      </w:tblGrid>
+      <w:tr>
+        <w:tc>
+          <w:tcPr>
+            <w:tcW w:type="dxa" w:w="1928"/>
+          </w:tcPr>
+          <w:p>
+            <w:pPr>
+              <w:spacing w:after="40"/>
+            </w:pPr>
+            <w:r/>
+            <w:r>
+              <w:rPr>
+                <w:b/>
+                <w:color w:val="1F3B63"/>
+                <w:sz w:val="18"/>
+              </w:rPr>
+              <w:t>Função</w:t>
+            </w:r>
+          </w:p>
+        </w:tc>
+        <w:tc>
+          <w:tcPr>
+            <w:tcW w:type="dxa" w:w="2835"/>
+          </w:tcPr>
+          <w:p>
+            <w:pPr>
+              <w:spacing w:after="40"/>
+            </w:pPr>
+            <w:r/>
+            <w:r>
+              <w:rPr>
+                <w:b/>
+                <w:color w:val="1F3B63"/>
+                <w:sz w:val="18"/>
+              </w:rPr>
+              <w:t>Norma</w:t>
+            </w:r>
+          </w:p>
+        </w:tc>
+        <w:tc>
+          <w:tcPr>
+            <w:tcW w:type="dxa" w:w="4025"/>
+          </w:tcPr>
+          <w:p>
+            <w:pPr>
+              <w:spacing w:after="40"/>
+            </w:pPr>
+            <w:r/>
+            <w:r>
+              <w:rPr>
+                <w:b/>
+                <w:color w:val="1F3B63"/>
+                <w:sz w:val="18"/>
+              </w:rPr>
+              <w:t>Elemento relevante</w:t>
+            </w:r>
+          </w:p>
+        </w:tc>
+      </w:tr>
+      <w:tr>
+        <w:tc>
+          <w:tcPr>
+            <w:tcW w:type="dxa" w:w="1928"/>
+          </w:tcPr>
+          <w:p>
+            <w:pPr>
+              <w:spacing w:after="40"/>
+              <w:jc w:val="both"/>
+            </w:pPr>
+            <w:r/>
+            <w:r>
+              <w:rPr>
+                <w:sz w:val="18"/>
+              </w:rPr>
+              <w:t>Captura e recolha</w:t>
+            </w:r>
+          </w:p>
+        </w:tc>
+        <w:tc>
+          <w:tcPr>
+            <w:tcW w:type="dxa" w:w="2835"/>
+          </w:tcPr>
+          <w:p>
+            <w:pPr>
+              <w:spacing w:after="40"/>
+              <w:jc w:val="both"/>
+            </w:pPr>
+            <w:r/>
+            <w:r>
+              <w:rPr>
+                <w:sz w:val="18"/>
+              </w:rPr>
+              <w:t>Art.º 19.º do DL 276/2001 e art.º 8.º do DL 314/2003</w:t>
+            </w:r>
+          </w:p>
+        </w:tc>
+        <w:tc>
+          <w:tcPr>
+            <w:tcW w:type="dxa" w:w="4025"/>
+          </w:tcPr>
+          <w:p>
+            <w:pPr>
+              <w:spacing w:after="40"/>
+              <w:jc w:val="both"/>
+            </w:pPr>
+            <w:r/>
+            <w:r>
+              <w:rPr>
+                <w:sz w:val="18"/>
+              </w:rPr>
+              <w:t>Competência das câmaras municipais; os animais são recolhidos ao canil ou gatil municipal</w:t>
+            </w:r>
+          </w:p>
+        </w:tc>
+      </w:tr>
+      <w:tr>
+        <w:tc>
+          <w:tcPr>
+            <w:tcW w:type="dxa" w:w="1928"/>
+          </w:tcPr>
+          <w:p>
+            <w:pPr>
+              <w:spacing w:after="40"/>
+              <w:jc w:val="both"/>
+            </w:pPr>
+            <w:r/>
+            <w:r>
+              <w:rPr>
+                <w:sz w:val="18"/>
+              </w:rPr>
+              <w:t>Exame clínico e destino</w:t>
+            </w:r>
+          </w:p>
+        </w:tc>
+        <w:tc>
+          <w:tcPr>
+            <w:tcW w:type="dxa" w:w="2835"/>
+          </w:tcPr>
+          <w:p>
+            <w:pPr>
+              <w:spacing w:after="40"/>
+              <w:jc w:val="both"/>
+            </w:pPr>
+            <w:r/>
+            <w:r>
+              <w:rPr>
+                <w:sz w:val="18"/>
+              </w:rPr>
+              <w:t>Art.º 9.º, n.º 1, do DL 314/2003</w:t>
+            </w:r>
+          </w:p>
+        </w:tc>
+        <w:tc>
+          <w:tcPr>
+            <w:tcW w:type="dxa" w:w="4025"/>
+          </w:tcPr>
+          <w:p>
+            <w:pPr>
+              <w:spacing w:after="40"/>
+              <w:jc w:val="both"/>
+            </w:pPr>
+            <w:r/>
+            <w:r>
+              <w:rPr>
+                <w:sz w:val="18"/>
+              </w:rPr>
+              <w:t>Exame pelo médico-veterinário municipal, que decide o destino; permanência mínima de oito dias</w:t>
+            </w:r>
+          </w:p>
+        </w:tc>
+      </w:tr>
+      <w:tr>
+        <w:tc>
+          <w:tcPr>
+            <w:tcW w:type="dxa" w:w="1928"/>
+          </w:tcPr>
+          <w:p>
+            <w:pPr>
+              <w:spacing w:after="40"/>
+              <w:jc w:val="both"/>
+            </w:pPr>
+            <w:r/>
+            <w:r>
+              <w:rPr>
+                <w:sz w:val="18"/>
+              </w:rPr>
+              <w:t>Presunção de abandono</w:t>
+            </w:r>
+          </w:p>
+        </w:tc>
+        <w:tc>
+          <w:tcPr>
+            <w:tcW w:type="dxa" w:w="2835"/>
+          </w:tcPr>
+          <w:p>
+            <w:pPr>
+              <w:spacing w:after="40"/>
+              <w:jc w:val="both"/>
+            </w:pPr>
+            <w:r/>
+            <w:r>
+              <w:rPr>
+                <w:sz w:val="18"/>
+              </w:rPr>
+              <w:t>Art.º 3.º, n.º 1, da Lei n.º 27/2016</w:t>
+            </w:r>
+          </w:p>
+        </w:tc>
+        <w:tc>
+          <w:tcPr>
+            <w:tcW w:type="dxa" w:w="4025"/>
+          </w:tcPr>
+          <w:p>
+            <w:pPr>
+              <w:spacing w:after="40"/>
+              <w:jc w:val="both"/>
+            </w:pPr>
+            <w:r/>
+            <w:r>
+              <w:rPr>
+                <w:sz w:val="18"/>
+              </w:rPr>
+              <w:t>Decorridos quinze dias sobre a recolha sem reclamação, presumem-se abandonados e são obrigatoriamente esterilizados e encaminhados para adoção</w:t>
+            </w:r>
+          </w:p>
+        </w:tc>
+      </w:tr>
+      <w:tr>
+        <w:tc>
+          <w:tcPr>
+            <w:tcW w:type="dxa" w:w="1928"/>
+          </w:tcPr>
+          <w:p>
+            <w:pPr>
+              <w:spacing w:after="40"/>
+              <w:jc w:val="both"/>
+            </w:pPr>
+            <w:r/>
+            <w:r>
+              <w:rPr>
+                <w:sz w:val="18"/>
+              </w:rPr>
+              <w:t>Esterilização e CED</w:t>
+            </w:r>
+          </w:p>
+        </w:tc>
+        <w:tc>
+          <w:tcPr>
+            <w:tcW w:type="dxa" w:w="2835"/>
+          </w:tcPr>
+          <w:p>
+            <w:pPr>
+              <w:spacing w:after="40"/>
+              <w:jc w:val="both"/>
+            </w:pPr>
+            <w:r/>
+            <w:r>
+              <w:rPr>
+                <w:sz w:val="18"/>
+              </w:rPr>
+              <w:t>Art.º 4.º da Lei n.º 27/2016 e Portaria n.º 146/2017</w:t>
+            </w:r>
+          </w:p>
+        </w:tc>
+        <w:tc>
+          <w:tcPr>
+            <w:tcW w:type="dxa" w:w="4025"/>
+          </w:tcPr>
+          <w:p>
+            <w:pPr>
+              <w:spacing w:after="40"/>
+              <w:jc w:val="both"/>
+            </w:pPr>
+            <w:r/>
+            <w:r>
+              <w:rPr>
+                <w:sz w:val="18"/>
+              </w:rPr>
+              <w:t>Captura, vacinação e esterilização de errantes e execução dos programas de captura, esterilização e devolução</w:t>
+            </w:r>
+          </w:p>
+        </w:tc>
+      </w:tr>
+      <w:tr>
+        <w:tc>
+          <w:tcPr>
+            <w:tcW w:type="dxa" w:w="1928"/>
+          </w:tcPr>
+          <w:p>
+            <w:pPr>
+              <w:spacing w:after="40"/>
+              <w:jc w:val="both"/>
+            </w:pPr>
+            <w:r/>
+            <w:r>
+              <w:rPr>
+                <w:sz w:val="18"/>
+              </w:rPr>
+              <w:t>Despesas</w:t>
+            </w:r>
+          </w:p>
+        </w:tc>
+        <w:tc>
+          <w:tcPr>
+            <w:tcW w:type="dxa" w:w="2835"/>
+          </w:tcPr>
+          <w:p>
+            <w:pPr>
+              <w:spacing w:after="40"/>
+              <w:jc w:val="both"/>
+            </w:pPr>
+            <w:r/>
+            <w:r>
+              <w:rPr>
+                <w:sz w:val="18"/>
+              </w:rPr>
+              <w:t>Art.º 9.º, n.º 2, do DL 314/2003</w:t>
+            </w:r>
+          </w:p>
+        </w:tc>
+        <w:tc>
+          <w:tcPr>
+            <w:tcW w:type="dxa" w:w="4025"/>
+          </w:tcPr>
+          <w:p>
+            <w:pPr>
+              <w:spacing w:after="40"/>
+              <w:jc w:val="both"/>
+            </w:pPr>
+            <w:r/>
+            <w:r>
+              <w:rPr>
+                <w:sz w:val="18"/>
+              </w:rPr>
+              <w:t>Alimentação e alojamento a cargo do detentor</w:t>
+            </w:r>
+          </w:p>
+        </w:tc>
+      </w:tr>
+      <w:tr>
+        <w:tc>
+          <w:tcPr>
+            <w:tcW w:type="dxa" w:w="1928"/>
+          </w:tcPr>
+          <w:p>
+            <w:pPr>
+              <w:spacing w:after="40"/>
+              <w:jc w:val="both"/>
+            </w:pPr>
+            <w:r/>
+            <w:r>
+              <w:rPr>
+                <w:sz w:val="18"/>
+              </w:rPr>
+              <w:t>Cadáveres</w:t>
+            </w:r>
+          </w:p>
+        </w:tc>
+        <w:tc>
+          <w:tcPr>
+            <w:tcW w:type="dxa" w:w="2835"/>
+          </w:tcPr>
+          <w:p>
+            <w:pPr>
+              <w:spacing w:after="40"/>
+              <w:jc w:val="both"/>
+            </w:pPr>
+            <w:r/>
+            <w:r>
+              <w:rPr>
+                <w:sz w:val="18"/>
+              </w:rPr>
+              <w:t>Art.º 12.º do DL 314/2003</w:t>
+            </w:r>
+          </w:p>
+        </w:tc>
+        <w:tc>
+          <w:tcPr>
+            <w:tcW w:type="dxa" w:w="4025"/>
+          </w:tcPr>
+          <w:p>
+            <w:pPr>
+              <w:spacing w:after="40"/>
+              <w:jc w:val="both"/>
+            </w:pPr>
+            <w:r/>
+            <w:r>
+              <w:rPr>
+                <w:sz w:val="18"/>
+              </w:rPr>
+              <w:t>Destruição assegurada pelas câmaras municipais</w:t>
+            </w:r>
+          </w:p>
+        </w:tc>
+      </w:tr>
+      <w:tr>
+        <w:tc>
+          <w:tcPr>
+            <w:tcW w:type="dxa" w:w="1928"/>
+          </w:tcPr>
+          <w:p>
+            <w:pPr>
+              <w:spacing w:after="40"/>
+              <w:jc w:val="both"/>
+            </w:pPr>
+            <w:r/>
+            <w:r>
+              <w:rPr>
+                <w:sz w:val="18"/>
+              </w:rPr>
+              <w:t>Relato</w:t>
+            </w:r>
+          </w:p>
+        </w:tc>
+        <w:tc>
+          <w:tcPr>
+            <w:tcW w:type="dxa" w:w="2835"/>
+          </w:tcPr>
+          <w:p>
+            <w:pPr>
+              <w:spacing w:after="40"/>
+              <w:jc w:val="both"/>
+            </w:pPr>
+            <w:r/>
+            <w:r>
+              <w:rPr>
+                <w:sz w:val="18"/>
+              </w:rPr>
+              <w:t>Art.º 3.º, n.ºs 9 e 10, da Lei n.º 27/2016</w:t>
+            </w:r>
+          </w:p>
+        </w:tc>
+        <w:tc>
+          <w:tcPr>
+            <w:tcW w:type="dxa" w:w="4025"/>
+          </w:tcPr>
+          <w:p>
+            <w:pPr>
+              <w:spacing w:after="40"/>
+              <w:jc w:val="both"/>
+            </w:pPr>
+            <w:r/>
+            <w:r>
+              <w:rPr>
+                <w:sz w:val="18"/>
+              </w:rPr>
+              <w:t>Relatório de gestão anual publicitado no primeiro mês do ano; relatório nacional da DGAV até ao fim do primeiro trimestre</w:t>
+            </w:r>
+          </w:p>
+        </w:tc>
+      </w:tr>
+      <w:tr>
+        <w:tc>
+          <w:tcPr>
+            <w:tcW w:type="dxa" w:w="1928"/>
+          </w:tcPr>
+          <w:p>
+            <w:pPr>
+              <w:spacing w:after="40"/>
+              <w:jc w:val="both"/>
+            </w:pPr>
+            <w:r/>
+            <w:r>
+              <w:rPr>
+                <w:sz w:val="18"/>
+              </w:rPr>
+              <w:t>Prazo do projeto</w:t>
+            </w:r>
+          </w:p>
+        </w:tc>
+        <w:tc>
+          <w:tcPr>
+            <w:tcW w:type="dxa" w:w="2835"/>
+          </w:tcPr>
+          <w:p>
+            <w:pPr>
+              <w:spacing w:after="40"/>
+              <w:jc w:val="both"/>
+            </w:pPr>
+            <w:r/>
+            <w:r>
+              <w:rPr>
+                <w:sz w:val="18"/>
+              </w:rPr>
+              <w:t>Art.º 59.º, n.º 3, do anexo</w:t>
+            </w:r>
+          </w:p>
+        </w:tc>
+        <w:tc>
+          <w:tcPr>
+            <w:tcW w:type="dxa" w:w="4025"/>
+          </w:tcPr>
+          <w:p>
+            <w:pPr>
+              <w:spacing w:after="40"/>
+              <w:jc w:val="both"/>
+            </w:pPr>
+            <w:r/>
+            <w:r>
+              <w:rPr>
+                <w:sz w:val="18"/>
+              </w:rPr>
+              <w:t>Cinco dias úteis para a recolha pelo detentor</w:t>
+            </w:r>
+          </w:p>
+        </w:tc>
+      </w:tr>
+    </w:tbl>
+    <w:p>
+      <w:pPr>
+        <w:spacing w:after="80"/>
+      </w:pPr>
+    </w:p>
+    <w:p>
+      <w:pPr>
+        <w:spacing w:after="120"/>
+      </w:pPr>
+      <w:r>
+        <w:rPr>
+          <w:b w:val="0"/>
+          <w:i w:val="0"/>
+          <w:sz w:val="21"/>
+        </w:rPr>
+        <w:t>Os prazos são, portanto, quatro e não coincidem: oito dias de permanência mínima, quinze dias para a presunção de abandono, dez dias no mínimo proposto pelo projeto de RGAC e cinco dias úteis no artigo do projeto em análise.</w:t>
+      </w:r>
+    </w:p>
+    <w:p>
+      <w:pPr>
+        <w:spacing w:before="240" w:after="80"/>
+      </w:pPr>
+      <w:r>
+        <w:rPr>
+          <w:b/>
+          <w:color w:val="1F3B63"/>
+          <w:sz w:val="22"/>
+        </w:rPr>
+        <w:t>4.3. A sede da matéria (registo interno, não invocar)</w:t>
+      </w:r>
+    </w:p>
+    <w:p>
+      <w:pPr>
+        <w:spacing w:after="120"/>
+      </w:pPr>
+      <w:r>
+        <w:rPr>
+          <w:b w:val="0"/>
+          <w:i w:val="0"/>
+          <w:sz w:val="21"/>
+        </w:rPr>
+        <w:t>Elemento de compreensão, não de pronúncia. O artigo está no Título II, «Requisitos de exercício», Capítulo II, «Requisitos especiais de exercício», Secção III, «Atividade pecuária», Subsecção IV, «Medidas Administrativas», entre o artigo das medidas administrativas e o das sanções acessórias. Foi aí colocado como medida de polícia do licenciamento pecuário: o animal errante é sintoma de incumprimento do dever de contenção, que é condição de exercício pela al. j) do n.º 1 do art.º 54.º, e o n.º 4 do art.º 59.º condiciona a devolução à verificação de que a exploração dispõe de condições que previnam nova fuga.</w:t>
+      </w:r>
+    </w:p>
+    <w:p>
+      <w:pPr>
+        <w:spacing w:after="120"/>
+      </w:pPr>
+      <w:r>
+        <w:rPr>
+          <w:b w:val="0"/>
+          <w:i w:val="0"/>
+          <w:sz w:val="21"/>
+        </w:rPr>
+        <w:t>O artigo foi inserido por inteiro em 23 de setembro de 2026, em nome de «Utilizador Convidado», no conjunto de cerca de noventa inserções dessa data, na véspera da reunião de 24 de setembro. O seu próprio autor deixou-lhe um comentário ancorado ao n.º 1: «Qual é a entidade competente?».</w:t>
+      </w:r>
+    </w:p>
+    <w:p>
+      <w:pPr>
+        <w:spacing w:before="240" w:after="80"/>
+      </w:pPr>
+      <w:r>
+        <w:rPr>
+          <w:b/>
+          <w:color w:val="1F3B63"/>
+          <w:sz w:val="22"/>
+        </w:rPr>
+        <w:t>4.4. Onde o projeto toca os centros de recolha oficial</w:t>
+      </w:r>
+    </w:p>
+    <w:p>
+      <w:pPr>
+        <w:pStyle w:val="ListBullet"/>
+        <w:spacing w:after="60"/>
+        <w:jc w:val="both"/>
+      </w:pPr>
+      <w:r>
+        <w:rPr>
+          <w:sz w:val="21"/>
+        </w:rPr>
+        <w:t>Pela omissão. O art.º 59.º não identifica instalação alguma, mas refere despesas de «alojamento» no n.º 3 e atribui ao município a determinação do destino no n.º 5. O município dispõe de uma única instalação de alojamento de animais, que é o centro de recolha oficial.</w:t>
+      </w:r>
+    </w:p>
+    <w:p>
+      <w:pPr>
+        <w:pStyle w:val="ListBullet"/>
+        <w:spacing w:after="60"/>
+        <w:jc w:val="both"/>
+      </w:pPr>
+      <w:r>
+        <w:rPr>
+          <w:sz w:val="21"/>
+        </w:rPr>
+        <w:t>Pela terminologia. A subal. i) da al. c) do art.º 48.º define «Centro de Agrupamento» como «os locais, como centros de recolha, feiras e mercados […] onde são agrupados animais provenientes de diferentes explorações». A expressão «centros de recolha» é a mesma que o Decreto-Lei n.º 276/2001 usa para o canil e o gatil municipais. A definição é herdada do art.º 2.º do Decreto-Lei n.º 81/2013, pelo que a coincidência não é nova; novo é o contacto, porque nada mandava, até agora, animais pecuários para a mão do município. Na pronúncia, basta a nota de que não são a mesma realidade.</w:t>
+      </w:r>
+    </w:p>
+    <w:p>
+      <w:pPr>
+        <w:pStyle w:val="ListBullet"/>
+        <w:spacing w:after="60"/>
+        <w:jc w:val="both"/>
+      </w:pPr>
+      <w:r>
+        <w:rPr>
+          <w:sz w:val="21"/>
+        </w:rPr>
+        <w:t>Pela capacidade e pelos meios. A Lei n.º 27/2016 afetou aos centros de recolha oficial uma missão determinada, e é sobre ela que se construíram os apoios públicos. Uma função adicional sem meios, com o encargo a recair no município sempre que o detentor não seja identificado, que é a regra no gado deambulante, compromete a missão existente.</w:t>
+      </w:r>
+    </w:p>
+    <w:p>
+      <w:pPr>
+        <w:spacing w:before="240" w:after="80"/>
+      </w:pPr>
+      <w:r>
+        <w:rPr>
+          <w:b/>
+          <w:color w:val="1F3B63"/>
+          <w:sz w:val="22"/>
+        </w:rPr>
+        <w:t>4.5. A solução já existe e está financiada</w:t>
+      </w:r>
+    </w:p>
+    <w:p>
+      <w:pPr>
+        <w:spacing w:after="120"/>
+      </w:pPr>
+      <w:r>
+        <w:rPr>
+          <w:b w:val="0"/>
+          <w:i w:val="0"/>
+          <w:sz w:val="21"/>
+        </w:rPr>
+        <w:t>Este é o contributo central. O projeto de RGAC prevê que os centros de recolha possam dispor de, pelo menos, um recinto multiespécie adequado a espécies pecuárias, cumprindo a legislação específica. E os Avisos de financiamento para construção e modernização de centros de recolha oficial fixaram a sala multiespécie como requisito mínimo de construção. Não é, por isso, necessário conceber solução nova: basta remeter para a que a administração já desenhou e financiou.</w:t>
+      </w:r>
+    </w:p>
+    <w:p>
+      <w:pPr>
+        <w:spacing w:after="120"/>
+      </w:pPr>
+      <w:r>
+        <w:rPr>
+          <w:b w:val="0"/>
+          <w:i w:val="0"/>
+          <w:color w:val="555555"/>
+          <w:sz w:val="19"/>
+        </w:rPr>
+        <w:t>Verificação pendente, e é a mais importante deste ponto: obter o texto dos Avisos, com número, ano e redação exata do requisito, para que a afirmação anterior seja citável. A referência foi transmitida oralmente e não consta dos ficheiros do repositório.</w:t>
+      </w:r>
+    </w:p>
+    <w:p>
+      <w:pPr>
+        <w:spacing w:before="240" w:after="80"/>
+      </w:pPr>
+      <w:r>
+        <w:rPr>
+          <w:b/>
+          <w:color w:val="1F3B63"/>
+          <w:sz w:val="22"/>
+        </w:rPr>
+        <w:t>4.6. Lapsos formais (registo interno, matéria dos juristas)</w:t>
+      </w:r>
+    </w:p>
+    <w:p>
+      <w:pPr>
+        <w:pStyle w:val="ListBullet"/>
+        <w:spacing w:after="60"/>
+        <w:jc w:val="both"/>
+      </w:pPr>
+      <w:r>
+        <w:rPr>
+          <w:sz w:val="21"/>
+        </w:rPr>
+        <w:t>O n.º 5 do art.º 59.º refere o prazo «referido no número anterior», mas o prazo está no n.º 3 e o n.º 4 não fixa prazo algum.</w:t>
+      </w:r>
+    </w:p>
+    <w:p>
+      <w:pPr>
+        <w:pStyle w:val="ListBullet"/>
+        <w:spacing w:after="60"/>
+        <w:jc w:val="both"/>
+      </w:pPr>
+      <w:r>
+        <w:rPr>
+          <w:sz w:val="21"/>
+        </w:rPr>
+        <w:t>O n.º 6 refere as despesas «previstas no número anterior», mas as despesas estão no n.º 3 e não no n.º 5.</w:t>
+      </w:r>
+    </w:p>
+    <w:p>
+      <w:pPr>
+        <w:pStyle w:val="ListBullet"/>
+        <w:spacing w:after="60"/>
+        <w:jc w:val="both"/>
+      </w:pPr>
+      <w:r>
+        <w:rPr>
+          <w:sz w:val="21"/>
+        </w:rPr>
+        <w:t>O n.º 6 escreve «quando identificada» onde deveria ler-se «quando identificado».</w:t>
+      </w:r>
+    </w:p>
+    <w:p>
+      <w:pPr>
+        <w:spacing w:before="240" w:after="80"/>
+      </w:pPr>
+      <w:r>
+        <w:rPr>
+          <w:b/>
+          <w:color w:val="1F3B63"/>
+          <w:sz w:val="22"/>
+        </w:rPr>
+        <w:t>4.7. Fontes do ponto 04</w:t>
+      </w:r>
+    </w:p>
+    <w:p>
+      <w:pPr>
+        <w:pStyle w:val="ListBullet"/>
+        <w:spacing w:after="60"/>
+        <w:jc w:val="both"/>
+      </w:pPr>
+      <w:r>
+        <w:rPr>
+          <w:sz w:val="21"/>
+        </w:rPr>
+        <w:t>Projeto: art.ºs 48.º, al. c), 54.º, 55.º, 57.º, 58.º e 59.º do anexo; estrutura do Título II; ficha de avaliação legislativa, quadro das audições obrigatórias.</w:t>
+      </w:r>
+    </w:p>
+    <w:p>
+      <w:pPr>
+        <w:pStyle w:val="ListBullet"/>
+        <w:spacing w:after="60"/>
+        <w:jc w:val="both"/>
+      </w:pPr>
+      <w:r>
+        <w:rPr>
+          <w:sz w:val="21"/>
+        </w:rPr>
+        <w:t>Decreto-Lei n.º 276/2001 — art.ºs 2.º, n.º 1, als. c) e t), 3.º, n.º 1, al. a), e 19.º.</w:t>
+      </w:r>
+    </w:p>
+    <w:p>
+      <w:pPr>
+        <w:pStyle w:val="ListBullet"/>
+        <w:spacing w:after="60"/>
+        <w:jc w:val="both"/>
+      </w:pPr>
+      <w:r>
+        <w:rPr>
+          <w:sz w:val="21"/>
+        </w:rPr>
+        <w:t>Decreto-Lei n.º 314/2003 — art.ºs 2.º, al. n), 8.º, 9.º, 10.º, 11.º e 12.º.</w:t>
+      </w:r>
+    </w:p>
+    <w:p>
+      <w:pPr>
+        <w:pStyle w:val="ListBullet"/>
+        <w:spacing w:after="60"/>
+        <w:jc w:val="both"/>
+      </w:pPr>
+      <w:r>
+        <w:rPr>
+          <w:sz w:val="21"/>
+        </w:rPr>
+        <w:t>Lei n.º 27/2016 — art.ºs 1.º a 5.º, em especial o n.º 1 do art.º 3.º e os n.ºs 9 e 10 do mesmo artigo.</w:t>
+      </w:r>
+    </w:p>
+    <w:p>
+      <w:pPr>
+        <w:pStyle w:val="ListBullet"/>
+        <w:spacing w:after="60"/>
+        <w:jc w:val="both"/>
+      </w:pPr>
+      <w:r>
+        <w:rPr>
+          <w:sz w:val="21"/>
+        </w:rPr>
+        <w:t>Portaria n.º 146/2017 — normas técnicas dos programas de captura, esterilização e devolução.</w:t>
+      </w:r>
+    </w:p>
+    <w:p>
+      <w:pPr>
+        <w:pStyle w:val="ListBullet"/>
+        <w:spacing w:after="60"/>
+        <w:jc w:val="both"/>
+      </w:pPr>
+      <w:r>
+        <w:rPr>
+          <w:sz w:val="21"/>
+        </w:rPr>
+        <w:t>Código Civil, art.º 1323.º, na redação da Lei n.º 8/2017 — regime do animal achado, aplicável a qualquer espécie.</w:t>
+      </w:r>
+    </w:p>
+    <w:p>
+      <w:pPr>
+        <w:pStyle w:val="ListBullet"/>
+        <w:spacing w:after="60"/>
+        <w:jc w:val="both"/>
+      </w:pPr>
+      <w:r>
+        <w:rPr>
+          <w:sz w:val="21"/>
+        </w:rPr>
+        <w:t>Código da Estrada, art.º 92.º — condução de animais na via pública. A norma que sanciona o proprietário que deixe o animal vaguear não foi confirmada quanto ao número do artigo.</w:t>
+      </w:r>
+    </w:p>
+    <w:p>
+      <w:pPr>
+        <w:pStyle w:val="ListBullet"/>
+        <w:spacing w:after="60"/>
+        <w:jc w:val="both"/>
+      </w:pPr>
+      <w:r>
+        <w:rPr>
+          <w:sz w:val="21"/>
+        </w:rPr>
+        <w:t>Portaria n.º 1112/2009 — Rede Nacional de Centros de Recuperação de Fauna, coordenada pelo ICNF em articulação com a DGAV, para animais selvagens.</w:t>
+      </w:r>
+    </w:p>
+    <w:p>
+      <w:pPr>
+        <w:pStyle w:val="ListBullet"/>
+        <w:spacing w:after="60"/>
+        <w:jc w:val="both"/>
+      </w:pPr>
+      <w:r>
+        <w:rPr>
+          <w:sz w:val="21"/>
+        </w:rPr>
+        <w:t>Projeto de RGAC — artigo relativo aos centros de recolha, quanto ao recinto multiespécie. Trabalho em curso, citado como tal.</w:t>
+      </w:r>
+    </w:p>
+    <w:p>
+      <w:pPr>
+        <w:spacing w:before="360" w:after="120"/>
+      </w:pPr>
+      <w:r>
+        <w:rPr>
+          <w:b/>
+          <w:color w:val="1F3B63"/>
+          <w:sz w:val="26"/>
+        </w:rPr>
         <w:t>Ponto 5-R — Resíduos do tema eliminado da venda não sedentária, feiras e leilões</w:t>
       </w:r>
     </w:p>
@@ -4277,6 +5258,44 @@
                 <w:sz w:val="18"/>
               </w:rPr>
               <w:t>Alteração</w:t>
+            </w:r>
+          </w:p>
+        </w:tc>
+      </w:tr>
+      <w:tr>
+        <w:tc>
+          <w:tcPr>
+            <w:tcW w:type="dxa" w:w="1361"/>
+          </w:tcPr>
+          <w:p>
+            <w:pPr>
+              <w:spacing w:after="40"/>
+              <w:jc w:val="both"/>
+            </w:pPr>
+            <w:r/>
+            <w:r>
+              <w:rPr>
+                <w:sz w:val="18"/>
+              </w:rPr>
+              <w:t>6.10.2026</w:t>
+            </w:r>
+          </w:p>
+        </w:tc>
+        <w:tc>
+          <w:tcPr>
+            <w:tcW w:type="dxa" w:w="7427"/>
+          </w:tcPr>
+          <w:p>
+            <w:pPr>
+              <w:spacing w:after="40"/>
+              <w:jc w:val="both"/>
+            </w:pPr>
+            <w:r/>
+            <w:r>
+              <w:rPr>
+                <w:sz w:val="18"/>
+              </w:rPr>
+              <w:t>Fundamentação do ponto 04, com o regime vigente dos centros de recolha oficial, o quadro das funções e dos quatro prazos, a articulação com o projeto e a solução do recinto multiespécie. Fixada a postura do ponto: sem discussão da sede da matéria e sem crítica de técnica legislativa, que ficam como registo interno.</w:t>
             </w:r>
           </w:p>
         </w:tc>

</xml_diff>